<commit_message>
feat: implement pluggable enrichment framework and threat modeling engine
- Refactor enrichment process to use a pluggable framework allowing for easy addition of new enrichers.
- Introduce built-in enrichers: CISA KEV, FIRST EPSS, Reachability, and optional AI enrichment.
- Update documentation to reflect changes in enrichment architecture and API.
- Add ThreatModelEngine for generating threat models based on findings and attack chains.
- Enhance the web UI to support viewing and managing threat models.
- Update configuration management to include threat model settings.
- Implement tests for the enrichment framework and threat modeling logic.
</commit_message>
<xml_diff>
--- a/docs/DESIGN.docx
+++ b/docs/DESIGN.docx
@@ -1697,7 +1697,7 @@
         <w:spacing w:after="80" w:before="180"/>
       </w:pPr>
       <w:r>
-        <w:t xml:space="preserve">5.3 Enrichment (deterministic signals)</w:t>
+        <w:t xml:space="preserve">5.3 Enrichment (pluggable framework)</w:t>
       </w:r>
     </w:p>
     <w:p>
@@ -1705,7 +1705,67 @@
         <w:spacing w:after="120"/>
       </w:pPr>
       <w:r>
-        <w:t xml:space="preserve">enrich/enricher.py attaches three grounded facts before the LLM runs: CISA KEV (actively exploited?), FIRST EPSS (exploitation probability, batched), and reachability (heuristic over scanner metadata; True/False/unknown). These run first because they are cheap and authoritative, and because the LLM should reason over them rather than recall CVE trivia. Network failures degrade gracefully rather than failing the run.</w:t>
+        <w:t xml:space="preserve">Enrichment is a framework, not a fixed step. Each source is a BaseEnricher (enrich/) with an enrich(findings) method; build_enrichers assembles the enabled ones from config and runs them in order. Adding a source (VEX, asset criticality, exploit-DB) is a new subclass with no pipeline change.</w:t>
+      </w:r>
+    </w:p>
+    <w:p>
+      <w:pPr>
+        <w:pStyle w:val="ListParagraph"/>
+        <w:numPr>
+          <w:ilvl w:val="0"/>
+          <w:numId w:val="1"/>
+        </w:numPr>
+        <w:spacing w:after="40"/>
+      </w:pPr>
+      <w:r>
+        <w:t xml:space="preserve">CISA KEV — is the CVE actively exploited in the wild?</w:t>
+      </w:r>
+    </w:p>
+    <w:p>
+      <w:pPr>
+        <w:pStyle w:val="ListParagraph"/>
+        <w:numPr>
+          <w:ilvl w:val="0"/>
+          <w:numId w:val="1"/>
+        </w:numPr>
+        <w:spacing w:after="40"/>
+      </w:pPr>
+      <w:r>
+        <w:t xml:space="preserve">FIRST EPSS — probability of exploitation (batched lookups).</w:t>
+      </w:r>
+    </w:p>
+    <w:p>
+      <w:pPr>
+        <w:pStyle w:val="ListParagraph"/>
+        <w:numPr>
+          <w:ilvl w:val="0"/>
+          <w:numId w:val="1"/>
+        </w:numPr>
+        <w:spacing w:after="40"/>
+      </w:pPr>
+      <w:r>
+        <w:t xml:space="preserve">Reachability — heuristic over scanner metadata; True/False/unknown (negative phrasing checked first).</w:t>
+      </w:r>
+    </w:p>
+    <w:p>
+      <w:pPr>
+        <w:pStyle w:val="ListParagraph"/>
+        <w:numPr>
+          <w:ilvl w:val="0"/>
+          <w:numId w:val="1"/>
+        </w:numPr>
+        <w:spacing w:after="40"/>
+      </w:pPr>
+      <w:r>
+        <w:t xml:space="preserve">AI enrichment (optional, cheap tier) — remediation guidance + categorization tags, plus a reachability judgement when the scanner gave none. Complements the exploitability engine; routed to the enrichment task (Haiku by default).</w:t>
+      </w:r>
+    </w:p>
+    <w:p>
+      <w:pPr>
+        <w:spacing w:after="120"/>
+      </w:pPr>
+      <w:r>
+        <w:t xml:space="preserve">Deterministic enrichers run first — cheap, authoritative, and grounding for the LLM stages. Each is toggleable in config and from the config UI. Network failures degrade gracefully rather than failing the run.</w:t>
       </w:r>
     </w:p>
     <w:p>
@@ -2522,7 +2582,15 @@
         <w:spacing w:after="120"/>
       </w:pPr>
       <w:r>
-        <w:t xml:space="preserve">A FastAPI backend holds the latest result in memory; the frontend is a single dependency-free HTML page. The dashboard is the triage queue with filters, signal badges, a per-finding detail drawer (CVSS vector, EPSS, reachability, provenance, rationale, chains), and inline validation-state editing that persists to the sticky store.</w:t>
+        <w:t xml:space="preserve">A FastAPI backend holds the latest result in memory; the frontend is a single dependency-free HTML page with two views. Findings: the triage queue with filters, signal badges, a per-finding detail drawer (CVSS vector, EPSS, reachability, provenance, rationale, remediation, tags, chains), and inline validation-state editing that persists to the sticky store.</w:t>
+      </w:r>
+    </w:p>
+    <w:p>
+      <w:pPr>
+        <w:spacing w:after="120"/>
+      </w:pPr>
+      <w:r>
+        <w:t xml:space="preserve">Config: edit non-secret settings live — default AI tier, per-task model routing, enrichment toggles, scoring weights, and the ServiceNow push flag. Secrets are shown masked and read-only (they stay in the environment). Edits apply to the next scan and persist to config.overrides.json, layered over the base config on restart; POST is validated server-side and rejected with 400 on bad input.</w:t>
       </w:r>
     </w:p>
     <w:p>

</xml_diff>

<commit_message>
feat: Enhance threat modeling and scoring mechanisms
- Introduced a threat modeling feature that generates STRIDE threat models per service, linking findings and chains.
- Updated scoring logic to incorporate a threat boost based on threat model outputs, enriching exploitability dimensions.
- Added configuration options for ServiceNow output format (JSON/CSV) and threat boost settings.
- Enhanced documentation to reflect changes in threat modeling and scoring processes.
- Updated web UI to display threat models and associated findings, improving analyst triage capabilities.
- Implemented CSV export functionality for ServiceNow records, ensuring compatibility with Import Sets.
- Added tests for new threat modeling features and ServiceNow export formats.
</commit_message>
<xml_diff>
--- a/docs/DESIGN.docx
+++ b/docs/DESIGN.docx
@@ -2384,7 +2384,7 @@
                 <w:sz w:val="20"/>
                 <w:szCs w:val="20"/>
               </w:rPr>
-              <w:t xml:space="preserve">AI score, EPSS, KEV (averaged)</w:t>
+              <w:t xml:space="preserve">AI score, EPSS, KEV, threat signal (averaged)</w:t>
             </w:r>
           </w:p>
         </w:tc>
@@ -2531,7 +2531,7 @@
         <w:spacing w:after="120"/>
       </w:pPr>
       <w:r>
-        <w:t xml:space="preserve">Two overrides on top of the blend: a KEV floor (anything actively exploited is floored to 85 — exploited-in-the-wild outweighs modelling) and a corroboration bonus (+2 when both scanners agree). This reordering is what makes the queue useful: an unreachable critical drops below a reachable, chainable high.</w:t>
+        <w:t xml:space="preserve">Adjustments on top of the blend: a KEV floor (anything actively exploited is floored to 85), a corroboration bonus (+2 when both scanners agree), and a threat boost — an additive bonus (up to threat_boost, default 15) for findings implicated by the service threat model, scaled by the stronger of the finding's threat signal and its service posture (5.10). Additive, so runs without threat modeling aren't penalized; threats also enrich the exploitability dimension directly. This is what makes the queue useful: an unreachable critical drops below a reachable, chainable, threatened high.</w:t>
       </w:r>
     </w:p>
     <w:p>
@@ -2565,7 +2565,7 @@
         <w:spacing w:after="120"/>
       </w:pPr>
       <w:r>
-        <w:t xml:space="preserve">Builds sn_vul_vulnerable_item records, highest-risk first, carrying the composite score, risk rating, validation state, and the exploitability rationale plus attack-chain context in the work notes — so a responder sees why the tool ranked it. correlation_id is the fingerprint, making the import idempotent: re-runs upsert the same item and closed items stay closed. Output is written to a file, or POSTed to the import table via the Table API.</w:t>
+        <w:t xml:space="preserve">Builds sn_vul_vulnerable_item records, highest-risk first, carrying the composite score, risk rating, validation state, and the exploitability rationale plus attack-chain context in the work notes — so a responder sees why the tool ranked it. correlation_id is the fingerprint, making the import idempotent: re-runs upsert the same item and closed items stay closed. Output is written to a file — JSON (servicenow_import.json) or, when servicenow.format is csv, a CSV (servicenow_import.csv) for CSV Import Sets, with multi-line work notes quoted correctly — or POSTed to the import table via the Table API. The format is settable in config, the config UI, or with --sn-format on the CLI.</w:t>
       </w:r>
     </w:p>
     <w:p>
@@ -2582,7 +2582,7 @@
         <w:spacing w:after="120"/>
       </w:pPr>
       <w:r>
-        <w:t xml:space="preserve">A FastAPI backend holds the latest result in memory; the frontend is a single dependency-free HTML page with two views. Findings: the triage queue with filters, signal badges, a per-finding detail drawer (CVSS vector, EPSS, reachability, provenance, rationale, remediation, tags, chains), and inline validation-state editing that persists to the sticky store.</w:t>
+        <w:t xml:space="preserve">A FastAPI backend holds the latest result in memory; the frontend is a single dependency-free HTML page with three views. Findings: the triage queue with filters, signal badges, a per-finding detail drawer (CVSS vector, EPSS, reachability, provenance, rationale, remediation, tags, threats, chains), and inline validation-state editing that persists to the sticky store.</w:t>
       </w:r>
     </w:p>
     <w:p>
@@ -2590,7 +2590,100 @@
         <w:spacing w:after="120"/>
       </w:pPr>
       <w:r>
-        <w:t xml:space="preserve">Config: edit non-secret settings live — default AI tier, per-task model routing, enrichment toggles, scoring weights, and the ServiceNow push flag. Secrets are shown masked and read-only (they stay in the environment). Edits apply to the next scan and persist to config.overrides.json, layered over the base config on restart; POST is validated server-side and rejected with 400 on bad input.</w:t>
+        <w:t xml:space="preserve">Threats: the per-service threat models (5.10) — STRIDE threats with linked findings/chains, assets, entry points, trust boundaries, posture, and recommendations.</w:t>
+      </w:r>
+    </w:p>
+    <w:p>
+      <w:pPr>
+        <w:spacing w:after="120"/>
+      </w:pPr>
+      <w:r>
+        <w:t xml:space="preserve">Config: edit non-secret settings live — default AI tier, per-task model routing, enrichment toggles, threat-modeling toggle, scoring weights, and the ServiceNow push flag. Secrets are shown masked and read-only (they stay in the environment). Edits apply to the next scan and persist to config.overrides.json, layered over the base config on restart; POST is validated server-side and rejected with 400 on bad input.</w:t>
+      </w:r>
+    </w:p>
+    <w:p>
+      <w:pPr>
+        <w:pStyle w:val="Heading2"/>
+        <w:spacing w:after="80" w:before="180"/>
+      </w:pPr>
+      <w:r>
+        <w:t xml:space="preserve">5.10 Threat modeling (threatmodel.py, optional, deep tier)</w:t>
+      </w:r>
+    </w:p>
+    <w:p>
+      <w:pPr>
+        <w:spacing w:after="120"/>
+      </w:pPr>
+      <w:r>
+        <w:t xml:space="preserve">Where the exploitability engine works bottom-up (per-finding scores, concrete chains), threat modeling is the top-down counterpart. Per service it produces a STRIDE threat model grounded in that service's findings and chains:</w:t>
+      </w:r>
+    </w:p>
+    <w:p>
+      <w:pPr>
+        <w:pStyle w:val="ListParagraph"/>
+        <w:numPr>
+          <w:ilvl w:val="0"/>
+          <w:numId w:val="1"/>
+        </w:numPr>
+        <w:spacing w:after="40"/>
+      </w:pPr>
+      <w:r>
+        <w:t xml:space="preserve">Assets — what an attacker targets (data, credentials, functionality) with a sensitivity note.</w:t>
+      </w:r>
+    </w:p>
+    <w:p>
+      <w:pPr>
+        <w:pStyle w:val="ListParagraph"/>
+        <w:numPr>
+          <w:ilvl w:val="0"/>
+          <w:numId w:val="1"/>
+        </w:numPr>
+        <w:spacing w:after="40"/>
+      </w:pPr>
+      <w:r>
+        <w:t xml:space="preserve">Entry points / trust boundaries — the attack surface implied by the components and findings.</w:t>
+      </w:r>
+    </w:p>
+    <w:p>
+      <w:pPr>
+        <w:pStyle w:val="ListParagraph"/>
+        <w:numPr>
+          <w:ilvl w:val="0"/>
+          <w:numId w:val="1"/>
+        </w:numPr>
+        <w:spacing w:after="40"/>
+      </w:pPr>
+      <w:r>
+        <w:t xml:space="preserve">Threats — STRIDE-categorized, each citing the related finding IDs and chain IDs that evidence it, plus likelihood, impact, and mitigations. Prefer fewer, well-grounded threats over generic ones.</w:t>
+      </w:r>
+    </w:p>
+    <w:p>
+      <w:pPr>
+        <w:pStyle w:val="ListParagraph"/>
+        <w:numPr>
+          <w:ilvl w:val="0"/>
+          <w:numId w:val="1"/>
+        </w:numPr>
+        <w:spacing w:after="40"/>
+      </w:pPr>
+      <w:r>
+        <w:t xml:space="preserve">Posture — an overall risk level, summary, and prioritized recommendations.</w:t>
+      </w:r>
+    </w:p>
+    <w:p>
+      <w:pPr>
+        <w:spacing w:after="120"/>
+      </w:pPr>
+      <w:r>
+        <w:t xml:space="preserve">Optional (threat_model.enabled), per-service, routed to the threat_model task (the default deep tier unless overridden), and emits a threat_models.json artifact alongside the ServiceNow export. Threats reference findings by ID, so the UI cross-links both directions.</w:t>
+      </w:r>
+    </w:p>
+    <w:p>
+      <w:pPr>
+        <w:spacing w:after="120"/>
+      </w:pPr>
+      <w:r>
+        <w:t xml:space="preserve">It feeds back into scoring. Because it runs before the scorer, apply_threat_influence writes results back onto findings: it records the citing threat IDs, derives a per-finding threat signal (0-100 from the strongest citing threat's likelihood), and raises the categorical exploitability level when the threat implies more than the isolated assessment did. The scorer then consumes the threat signal (exploitability dimension) and the per-service risk posture (additive threat boost).</w:t>
       </w:r>
     </w:p>
     <w:p>

</xml_diff>

<commit_message>
feat: Refactor threat modeling and scoring logic; remove threat boost configuration
</commit_message>
<xml_diff>
--- a/docs/DESIGN.docx
+++ b/docs/DESIGN.docx
@@ -2531,7 +2531,7 @@
         <w:spacing w:after="120"/>
       </w:pPr>
       <w:r>
-        <w:t xml:space="preserve">Adjustments on top of the blend: a KEV floor (anything actively exploited is floored to 85), a corroboration bonus (+2 when both scanners agree), and a threat boost — an additive bonus (up to threat_boost, default 15) for findings implicated by the service threat model, scaled by the stronger of the finding's threat signal and its service posture (5.10). Additive, so runs without threat modeling aren't penalized; threats also enrich the exploitability dimension directly. This is what makes the queue useful: an unreachable critical drops below a reachable, chainable, threatened high.</w:t>
+        <w:t xml:space="preserve">Adjustments on top of the blend: a KEV floor (anything actively exploited is floored to 85) and a corroboration bonus (+2 when both scanners agree). Threat models influence the score in exactly one place — the exploitability dimension: a cited finding's threat signal is one of the averaged exploitability inputs, so a threatened finding scores higher, counted once. Runs without threat modeling are unaffected. This is what makes the queue useful: an unreachable critical drops below a reachable, chainable, threatened high.</w:t>
       </w:r>
     </w:p>
     <w:p>
@@ -2683,7 +2683,7 @@
         <w:spacing w:after="120"/>
       </w:pPr>
       <w:r>
-        <w:t xml:space="preserve">It feeds back into scoring. Because it runs before the scorer, apply_threat_influence writes results back onto findings: it records the citing threat IDs, derives a per-finding threat signal (0-100 from the strongest citing threat's likelihood), and raises the categorical exploitability level when the threat implies more than the isolated assessment did. The scorer then consumes the threat signal (exploitability dimension) and the per-service risk posture (additive threat boost).</w:t>
+        <w:t xml:space="preserve">It feeds back into scoring. Because it runs before the scorer, apply_threat_influence writes results back onto findings: it records the citing threat IDs, derives a per-finding threat signal (0-100 from the strongest citing threat's likelihood), and raises the categorical exploitability level when the threat implies more than the isolated assessment did. The scorer reflects this through the exploitability dimension only, so the threat is counted once.</w:t>
       </w:r>
     </w:p>
     <w:p>

</xml_diff>

<commit_message>
feat: Implement threat modeling engine and validation state assignment
- Added a new threat modeling engine in `threatmodel.py` to generate STRIDE threat models based on findings and attack chains.
- Introduced a validation state assignment mechanism in `validation.py` to classify findings based on exploitability and analyst input.
- Developed a FastAPI backend in `web.py` to serve a web UI for interacting with the codescan pipeline, including endpoints for scanning and state management.
- Created a Docker setup with `docker-compose.yml` and `docker-entrypoint.sh` for easy deployment of the application.
- Added a GitHub connector in `github.py` to enumerate repositories from GitHub, allowing for integration with GitHub as a source control management provider.
- Implemented unit tests for the GitHub connector and provider selection in `test_github.py` to ensure functionality without network dependency.
</commit_message>
<xml_diff>
--- a/docs/DESIGN.docx
+++ b/docs/DESIGN.docx
@@ -628,7 +628,7 @@
                 <w:sz w:val="20"/>
                 <w:szCs w:val="20"/>
               </w:rPr>
-              <w:t xml:space="preserve">connectors/bitbucket.py — on-prem REST API builds the repo inventory (scan surface).</w:t>
+              <w:t xml:space="preserve">connectors/bitbucket.py — builds the repo inventory. GitHub/GHES (connectors/github.py) is a selectable alternative via source.provider.</w:t>
             </w:r>
           </w:p>
         </w:tc>
@@ -1653,7 +1653,15 @@
         <w:spacing w:after="120"/>
       </w:pPr>
       <w:r>
-        <w:t xml:space="preserve">All three extend a shared HttpClient (bearer auth, retry/backoff on 429/5xx, paging). Each has two ingestion paths: fetch() for a live API pull and from_file() for a native scanner export. The offline path is not just for demos — it makes the pipeline runnable in CI, in tests, and against archived scan data with zero credentials. Repo mapping (Snyk projects / Xray builds back to Bitbucket repos) is the documented integration point to harden for production.</w:t>
+        <w:t xml:space="preserve">All connectors extend a shared HttpClient (bearer auth, retry/backoff on 429/5xx, paging). Scanner connectors (Snyk, Xray) have two ingestion paths: fetch() for a live API pull and from_file() for a native scanner export. The offline path is not just for demos — it makes the pipeline runnable in CI, in tests, and against archived scan data with zero credentials.</w:t>
+      </w:r>
+    </w:p>
+    <w:p>
+      <w:pPr>
+        <w:spacing w:after="120"/>
+      </w:pPr>
+      <w:r>
+        <w:t xml:space="preserve">The repo inventory (scan surface) comes from a pluggable SCM source: Bitbucket Data Center (bitbucket.py) or GitHub / GitHub Enterprise Server (github.py), selected by source.provider (editable in the config UI). Both emit the same Repo list; GitHub's identity is owner/name (its full_name), so Snyk/Xray findings anchor to the same repo regardless of provider. Repo mapping (Snyk projects / Xray builds back to repos) is the documented integration point to harden for production.</w:t>
       </w:r>
     </w:p>
     <w:p>
@@ -2603,6 +2611,14 @@
     </w:p>
     <w:p>
       <w:pPr>
+        <w:spacing w:after="120"/>
+      </w:pPr>
+      <w:r>
+        <w:t xml:space="preserve">Scans run from the header (AI / offline / live toggles + Run scan) via POST /api/scan, in-process, recording a last-run timestamp. On-demand live scans of Bitbucket/Snyk/Xray are supported, not just the boot mode. A failed run — e.g. live mode without credentials — is caught and shown in an error banner with the last good result preserved, rather than returning a 500; /healthz backs the container probe.</w:t>
+      </w:r>
+    </w:p>
+    <w:p>
+      <w:pPr>
         <w:pStyle w:val="Heading2"/>
         <w:spacing w:after="80" w:before="180"/>
       </w:pPr>
@@ -4094,6 +4110,19 @@
       </w:pPr>
       <w:r>
         <w:t xml:space="preserve">State store is a JSON file; a shared datastore is needed for concurrent runners / HA.</w:t>
+      </w:r>
+    </w:p>
+    <w:p>
+      <w:pPr>
+        <w:pStyle w:val="ListParagraph"/>
+        <w:numPr>
+          <w:ilvl w:val="0"/>
+          <w:numId w:val="1"/>
+        </w:numPr>
+        <w:spacing w:after="40"/>
+      </w:pPr>
+      <w:r>
+        <w:t xml:space="preserve">Single-instance runtime — the web server holds scan state in memory, so it runs as one replica. The shipped Dockerfile / docker-compose.yml deploy a single non-root container that writes runtime artifacts to a /data volume, with secrets injected via environment. Horizontal scale needs the shared datastore above.</w:t>
       </w:r>
     </w:p>
     <w:p>

</xml_diff>

<commit_message>
feat: enhance web UI with overview page and export functionality
- Added an overview page to the web UI displaying run status, key metrics, and quick actions.
- Implemented GET /api/export endpoint for downloading ServiceNow import files in JSON and CSV formats.
- Updated the configuration options to allow specifying GitHub repositories and organizations for targeted scans.
- Introduced OpenHack connector for ingesting findings from Hadrian OpenHack.
- Improved error handling in HttpClient for clearer feedback on client errors and missing base URLs.
- Enhanced the ServiceNow exporter to support CSV downloads with multi-line work notes.
- Updated documentation to reflect new features and changes in the configuration and UI.
</commit_message>
<xml_diff>
--- a/docs/DESIGN.docx
+++ b/docs/DESIGN.docx
@@ -2590,7 +2590,7 @@
         <w:spacing w:after="120"/>
       </w:pPr>
       <w:r>
-        <w:t xml:space="preserve">A FastAPI backend holds the latest result in memory; the frontend is a single dependency-free HTML page with three views. Findings: the triage queue with filters, signal badges, a per-finding detail drawer (CVSS vector, EPSS, reachability, provenance, rationale, remediation, tags, threats, chains), and inline validation-state editing that persists to the sticky store.</w:t>
+        <w:t xml:space="preserve">A FastAPI backend holds the latest result in memory; the frontend is a single dependency-free HTML page with four views, plus GET /api/export for JSON/CSV downloads. Overview: the landing page — run status (source, mode, last run), key metrics, a severity breakdown, quick actions (run, download JSON/CSV, jump to a tab), and an in-app usage guide, making the UI a complete usage surface with no CLI required. Findings: the triage queue with filters, signal badges, a per-finding detail drawer (CVSS vector, EPSS, reachability, provenance, rationale, remediation, tags, threats, chains), and inline validation-state editing that persists to the sticky store.</w:t>
       </w:r>
     </w:p>
     <w:p>
@@ -2606,7 +2606,7 @@
         <w:spacing w:after="120"/>
       </w:pPr>
       <w:r>
-        <w:t xml:space="preserve">Config: edit non-secret settings live — default AI tier, per-task model routing, enrichment toggles, threat-modeling toggle, scoring weights, and the ServiceNow push flag. Secrets are shown masked and read-only (they stay in the environment). Edits apply to the next scan and persist to config.overrides.json, layered over the base config on restart; POST is validated server-side and rejected with 400 on bad input.</w:t>
+        <w:t xml:space="preserve">Config: edit non-secret settings live — the repo source (Bitbucket/GitHub) and GitHub repo/org targets, default AI tier, per-task model routing, enrichment toggles, threat-modeling toggle, scoring weights, and the ServiceNow push flag/format. Secrets are shown masked and read-only (they stay in the environment). Edits apply to the next scan and persist to config.overrides.json, layered over the base config on restart; POST is validated server-side and rejected with 400 on bad input.</w:t>
       </w:r>
     </w:p>
     <w:p>

</xml_diff>

<commit_message>
feat: Enhance AI provider configuration and integrate OpenHack findings
- Added support for multiple AI providers (Anthropic, OpenAI, Google) in the configuration.
- Updated the UI to allow selection of AI provider and model for each task.
- Implemented OpenHack integration to ingest findings from external reviews.
- Enhanced the backend to handle OpenHack configuration and findings ingestion.
- Updated tests to cover new functionality for AI provider selection and OpenHack findings.
- Added new provider classes for Google and OpenAI, ensuring compatibility with existing interfaces.
</commit_message>
<xml_diff>
--- a/docs/DESIGN.docx
+++ b/docs/DESIGN.docx
@@ -927,7 +927,7 @@
       <w:r>
         <w:drawing>
           <wp:inline distT="0" distB="0" distL="0" distR="0">
-            <wp:extent cx="5943600" cy="3952875"/>
+            <wp:extent cx="5943600" cy="3619500"/>
             <wp:effectExtent t="0" r="0" b="0" l="0"/>
             <wp:docPr id="1" name="" descr="" title=""/>
             <wp:cNvGraphicFramePr>
@@ -952,7 +952,7 @@
                   <pic:spPr bwMode="auto">
                     <a:xfrm>
                       <a:off x="0" y="0"/>
-                      <a:ext cx="5943600" cy="3952875"/>
+                      <a:ext cx="5943600" cy="3619500"/>
                     </a:xfrm>
                     <a:prstGeom prst="rect">
                       <a:avLst/>
@@ -1661,6 +1661,14 @@
         <w:spacing w:after="120"/>
       </w:pPr>
       <w:r>
+        <w:t xml:space="preserve">Findings sources are pluggable. Beyond Snyk/Xray (SCA/CVE), a third source — Hadrian OpenHack (connectors/openhack.py) — ingests whitebox source-review findings from an OpenHack run directory (finding-candidates/*.json). These are first-party source issues with no CVE (dedup keys on title + path); they carry severity, target path, description, remediation, and OWASP/CWE-class tags, and flow through the same normalize -&gt; dedup -&gt; score -&gt; triage path — giving codescan findings for repos the SCA/CVE scanners never covered. codescan can ingest an existing run, or auto-invoke OpenHack during a live scan (openhack_runner.py): with openhack.auto it clones the repo and runs a configured command ({repo_path}/{output_dir} substituted, AI-provider env passed through), then ingests the output — the command is configurable because OpenHack is a multi-phase agentic tool with its own LLM setup.</w:t>
+      </w:r>
+    </w:p>
+    <w:p>
+      <w:pPr>
+        <w:spacing w:after="120"/>
+      </w:pPr>
+      <w:r>
         <w:t xml:space="preserve">The repo inventory (scan surface) comes from a pluggable SCM source: Bitbucket Data Center (bitbucket.py) or GitHub / GitHub Enterprise Server (github.py), selected by source.provider (editable in the config UI). Both emit the same Repo list; GitHub's identity is owner/name (its full_name), so Snyk/Xray findings anchor to the same repo regardless of provider. Repo mapping (Snyk projects / Xray builds back to repos) is the documented integration point to harden for production.</w:t>
       </w:r>
     </w:p>
@@ -1838,7 +1846,7 @@
         <w:spacing w:after="80" w:before="180"/>
       </w:pPr>
       <w:r>
-        <w:t xml:space="preserve">5.5 Model routing (llm.py)</w:t>
+        <w:t xml:space="preserve">5.5 Model routing + multi-provider harness (llm.py, providers/)</w:t>
       </w:r>
     </w:p>
     <w:p>
@@ -1846,7 +1854,7 @@
         <w:spacing w:after="120"/>
       </w:pPr>
       <w:r>
-        <w:t xml:space="preserve">Different tasks need different intelligence tiers. ModelRouter resolves a task name to a ModelSpec (model + effort + token budget); LLMClient adapts each request to the model's capabilities so callers never have to.</w:t>
+        <w:t xml:space="preserve">Every AI stage runs through a provider harness (providers/): each supplier — anthropic (native structured outputs, adaptive thinking, effort, Fable fallbacks), openai (and any OpenAI-compatible endpoint via OPENAI_BASE_URL), google (Gemini) — implements the same complete_json contract. Non-Anthropic SDKs are imported lazily, so they are optional deps. ModelRouter resolves a task to a ModelSpec (provider + model + effort + token budget) and LLMClient dispatches to the resolved supplier, so a task can run on any model from any supplier, set in config.</w:t>
       </w:r>
     </w:p>
     <w:tbl>

</xml_diff>

<commit_message>
feat: optional web API-token guard + design-doc refresh
- web.py: when CODESCAN_API_TOKEN is set, an HTTP middleware guards /api/*
  (constant-time compare of Authorization: Bearer / X-API-Token / cookie);
  /healthz and the static shell stay open. Visiting /?token=SECRET once sets an
  HttpOnly SameSite=strict cookie so the browser's same-origin API calls carry
  it. Unset = open (the SSO-fronted default). Defense in depth, not a proxy
  replacement.
- tests: no-auth default, 401 without token, accepted via header, cookie
  bootstrap flow (+4).
- docs: README deployment + env table, .env.example (CODESCAN_API_TOKEN,
  CODESCAN_LOG_LEVEL); DESIGN security/limitations/testing/failure-modes
  refreshed for the token guard, fail-loud config, resilient_map isolation,
  atomic state store, and CI/mypy; DESIGN.docx regenerated.

100 pass, ruff + mypy clean.

Co-Authored-By: Claude Opus 4.8 <noreply@anthropic.com>
</commit_message>
<xml_diff>
--- a/docs/DESIGN.docx
+++ b/docs/DESIGN.docx
@@ -4016,6 +4016,32 @@
     </w:p>
     <w:p>
       <w:pPr>
+        <w:pStyle w:val="ListParagraph"/>
+        <w:numPr>
+          <w:ilvl w:val="0"/>
+          <w:numId w:val="1"/>
+        </w:numPr>
+        <w:spacing w:after="40"/>
+      </w:pPr>
+      <w:r>
+        <w:t xml:space="preserve">Optional API-token guard — CODESCAN_API_TOKEN guards /api/* (Authorization: Bearer, X-API-Token, or a cookie set from /?token=) with a constant-time compare; healthz and the static shell stay open. Defense in depth for accidental exposure; SSO/RBAC belongs at the reverse proxy.</w:t>
+      </w:r>
+    </w:p>
+    <w:p>
+      <w:pPr>
+        <w:pStyle w:val="ListParagraph"/>
+        <w:numPr>
+          <w:ilvl w:val="0"/>
+          <w:numId w:val="1"/>
+        </w:numPr>
+        <w:spacing w:after="40"/>
+      </w:pPr>
+      <w:r>
+        <w:t xml:space="preserve">Fail-loud config — config models reject unknown keys (extra=forbid), so a misspelled security setting fails at load rather than silently reverting to a default.</w:t>
+      </w:r>
+    </w:p>
+    <w:p>
+      <w:pPr>
         <w:pStyle w:val="Heading1"/>
         <w:spacing w:after="120" w:before="260"/>
       </w:pPr>
@@ -4339,6 +4365,52 @@
                 <w:sz w:val="20"/>
                 <w:szCs w:val="20"/>
               </w:rPr>
+              <w:t xml:space="preserve">One repo's AI call fails</w:t>
+            </w:r>
+          </w:p>
+        </w:tc>
+        <w:tc>
+          <w:tcPr>
+            <w:tcW w:type="dxa" w:w="5960"/>
+            <w:tcMar>
+              <w:top w:type="dxa" w:w="40"/>
+              <w:left w:type="dxa" w:w="80"/>
+              <w:bottom w:type="dxa" w:w="40"/>
+              <w:right w:type="dxa" w:w="80"/>
+            </w:tcMar>
+          </w:tcPr>
+          <w:p>
+            <w:r>
+              <w:rPr>
+                <w:b w:val="false"/>
+                <w:bCs w:val="false"/>
+                <w:sz w:val="20"/>
+                <w:szCs w:val="20"/>
+              </w:rPr>
+              <w:t xml:space="preserve">Isolated by resilient_map — logged and skipped; other repos still complete.</w:t>
+            </w:r>
+          </w:p>
+        </w:tc>
+      </w:tr>
+      <w:tr>
+        <w:tc>
+          <w:tcPr>
+            <w:tcW w:type="dxa" w:w="3400"/>
+            <w:tcMar>
+              <w:top w:type="dxa" w:w="40"/>
+              <w:left w:type="dxa" w:w="80"/>
+              <w:bottom w:type="dxa" w:w="40"/>
+              <w:right w:type="dxa" w:w="80"/>
+            </w:tcMar>
+          </w:tcPr>
+          <w:p>
+            <w:r>
+              <w:rPr>
+                <w:b w:val="false"/>
+                <w:bCs w:val="false"/>
+                <w:sz w:val="20"/>
+                <w:szCs w:val="20"/>
+              </w:rPr>
               <w:t xml:space="preserve">ServiceNow push fails</w:t>
             </w:r>
           </w:p>
@@ -4361,7 +4433,53 @@
                 <w:sz w:val="20"/>
                 <w:szCs w:val="20"/>
               </w:rPr>
-              <w:t xml:space="preserve">Records are written to file first, then pushed; the file is the durable artifact.</w:t>
+              <w:t xml:space="preserve">File is written first (durable); push isolates per-record failures and logs an ok/failed summary.</w:t>
+            </w:r>
+          </w:p>
+        </w:tc>
+      </w:tr>
+      <w:tr>
+        <w:tc>
+          <w:tcPr>
+            <w:tcW w:type="dxa" w:w="3400"/>
+            <w:tcMar>
+              <w:top w:type="dxa" w:w="40"/>
+              <w:left w:type="dxa" w:w="80"/>
+              <w:bottom w:type="dxa" w:w="40"/>
+              <w:right w:type="dxa" w:w="80"/>
+            </w:tcMar>
+          </w:tcPr>
+          <w:p>
+            <w:r>
+              <w:rPr>
+                <w:b w:val="false"/>
+                <w:bCs w:val="false"/>
+                <w:sz w:val="20"/>
+                <w:szCs w:val="20"/>
+              </w:rPr>
+              <w:t xml:space="preserve">Crash mid state-store write</w:t>
+            </w:r>
+          </w:p>
+        </w:tc>
+        <w:tc>
+          <w:tcPr>
+            <w:tcW w:type="dxa" w:w="5960"/>
+            <w:tcMar>
+              <w:top w:type="dxa" w:w="40"/>
+              <w:left w:type="dxa" w:w="80"/>
+              <w:bottom w:type="dxa" w:w="40"/>
+              <w:right w:type="dxa" w:w="80"/>
+            </w:tcMar>
+          </w:tcPr>
+          <w:p>
+            <w:r>
+              <w:rPr>
+                <w:b w:val="false"/>
+                <w:bCs w:val="false"/>
+                <w:sz w:val="20"/>
+                <w:szCs w:val="20"/>
+              </w:rPr>
+              <w:t xml:space="preserve">Atomic temp-file + os.replace — the previous state is never truncated.</w:t>
             </w:r>
           </w:p>
         </w:tc>
@@ -4533,7 +4651,7 @@
         <w:spacing w:after="40"/>
       </w:pPr>
       <w:r>
-        <w:t xml:space="preserve">No auth on the web UI; add authn/authz before exposing it beyond a trusted network.</w:t>
+        <w:t xml:space="preserve">Web UI auth is a single shared token (CODESCAN_API_TOKEN), not per-user authn/z; front the dashboard with SSO for identity/RBAC.</w:t>
       </w:r>
     </w:p>
     <w:p>
@@ -4594,33 +4712,72 @@
         <w:spacing w:after="40"/>
       </w:pPr>
       <w:r>
-        <w:t xml:space="preserve">Concurrency (tests/test_concurrency.py) — order preservation, genuine parallelism (barrier), single-item sequential fallback.</w:t>
-      </w:r>
-    </w:p>
-    <w:p>
-      <w:pPr>
-        <w:pStyle w:val="ListParagraph"/>
-        <w:numPr>
-          <w:ilvl w:val="0"/>
-          <w:numId w:val="1"/>
-        </w:numPr>
-        <w:spacing w:after="40"/>
-      </w:pPr>
-      <w:r>
-        <w:t xml:space="preserve">Web API (tests/test_web.py) — FastAPI TestClient over state, scan, state-change (persisted across rescan), validation, and ServiceNow endpoints.</w:t>
-      </w:r>
-    </w:p>
-    <w:p>
-      <w:pPr>
-        <w:pStyle w:val="ListParagraph"/>
-        <w:numPr>
-          <w:ilvl w:val="0"/>
-          <w:numId w:val="1"/>
-        </w:numPr>
-        <w:spacing w:after="40"/>
-      </w:pPr>
-      <w:r>
-        <w:t xml:space="preserve">All tests run offline with no Anthropic key; AI stages are validated by contract (schema) rather than live calls.</w:t>
+        <w:t xml:space="preserve">Concurrency (tests/test_concurrency.py) — order preservation, genuine parallelism (barrier), single-item sequential fallback, and per-item failure isolation (resilient_map).</w:t>
+      </w:r>
+    </w:p>
+    <w:p>
+      <w:pPr>
+        <w:pStyle w:val="ListParagraph"/>
+        <w:numPr>
+          <w:ilvl w:val="0"/>
+          <w:numId w:val="1"/>
+        </w:numPr>
+        <w:spacing w:after="40"/>
+      </w:pPr>
+      <w:r>
+        <w:t xml:space="preserve">ServiceNow (tests/test_servicenow.py) — JSON/CSV output and the Table API push path (posts each record; a failing push doesn't abort the export).</w:t>
+      </w:r>
+    </w:p>
+    <w:p>
+      <w:pPr>
+        <w:pStyle w:val="ListParagraph"/>
+        <w:numPr>
+          <w:ilvl w:val="0"/>
+          <w:numId w:val="1"/>
+        </w:numPr>
+        <w:spacing w:after="40"/>
+      </w:pPr>
+      <w:r>
+        <w:t xml:space="preserve">State store (tests/test_validation.py) — atomic save round-trip, no temp leftover, crash-during-replace preserves the existing file.</w:t>
+      </w:r>
+    </w:p>
+    <w:p>
+      <w:pPr>
+        <w:pStyle w:val="ListParagraph"/>
+        <w:numPr>
+          <w:ilvl w:val="0"/>
+          <w:numId w:val="1"/>
+        </w:numPr>
+        <w:spacing w:after="40"/>
+      </w:pPr>
+      <w:r>
+        <w:t xml:space="preserve">Vault (tests/test_vault.py) — KV v1/v2 injection, override semantics, auth errors, and the Config.load wiring.</w:t>
+      </w:r>
+    </w:p>
+    <w:p>
+      <w:pPr>
+        <w:pStyle w:val="ListParagraph"/>
+        <w:numPr>
+          <w:ilvl w:val="0"/>
+          <w:numId w:val="1"/>
+        </w:numPr>
+        <w:spacing w:after="40"/>
+      </w:pPr>
+      <w:r>
+        <w:t xml:space="preserve">Web API (tests/test_web.py) — FastAPI TestClient over state, scan, state-change (persisted across rescan), validation, ServiceNow, and the API-token guard.</w:t>
+      </w:r>
+    </w:p>
+    <w:p>
+      <w:pPr>
+        <w:pStyle w:val="ListParagraph"/>
+        <w:numPr>
+          <w:ilvl w:val="0"/>
+          <w:numId w:val="1"/>
+        </w:numPr>
+        <w:spacing w:after="40"/>
+      </w:pPr>
+      <w:r>
+        <w:t xml:space="preserve">All tests run offline with no Anthropic key; AI stages are validated by contract (schema) rather than live calls. CI (.github/workflows/ci.yml) runs ruff + mypy + pytest on a 3.10-3.12 matrix and builds the image on every push/PR; mypy is a clean gate and the package ships py.typed.</w:t>
       </w:r>
     </w:p>
     <w:p>

</xml_diff>

<commit_message>
feat: decision snapshots + score-calibration report
Freeze a machine-belief snapshot (risk score, AI score, EPSS, KEV,
reachability, severity, repo) and a decided_at timestamp with every
persisted validation decision, in both the file and SQL state stores
(in-place ADD COLUMN migration for existing DBs). Grade those frozen
predictions against analysts' manual confirmed/false-positive outcomes
in a new calibration report: confirm rate by predicted-score bucket,
confirmed-vs-FP score separation, and the noisiest CWE/component
families. Surfaced as GET /api/calibration, a Calibration tab in the
UI, and 'codescan calibration' on the CLI.

Co-Authored-By: Claude Fable 5 <noreply@anthropic.com>
</commit_message>
<xml_diff>
--- a/docs/DESIGN.docx
+++ b/docs/DESIGN.docx
@@ -1266,7 +1266,7 @@
                 <w:sz w:val="20"/>
                 <w:szCs w:val="20"/>
               </w:rPr>
-              <w:t xml:space="preserve">dedup*.py, enrich/, exploitability.py, scoring.py, validation.py</w:t>
+              <w:t xml:space="preserve">dedup*.py, enrich/, exploitability.py, scoring.py, validation.py, feedback.py, calibration.py</w:t>
             </w:r>
           </w:p>
         </w:tc>
@@ -1288,7 +1288,7 @@
                 <w:sz w:val="20"/>
                 <w:szCs w:val="20"/>
               </w:rPr>
-              <w:t xml:space="preserve">Transform findings.</w:t>
+              <w:t xml:space="preserve">Transform findings; calibrate from feedback; grade score calibration.</w:t>
             </w:r>
           </w:p>
         </w:tc>
@@ -2672,7 +2672,7 @@
         <w:spacing w:after="120"/>
       </w:pPr>
       <w:r>
-        <w:t xml:space="preserve">Internal lifecycle mapped to ServiceNow VR states on export: new -&gt; under_investigation -&gt; confirmed / false_positive / risk_accepted / duplicate / resolved. The pipeline proposes a conservative initial state; a human confirms or overrides. Persistence is the important property: the StateStore persists each decision keyed by fingerprint and tags whether a human set it. On rescan, any manual decision or terminal closure is honored and never re-opened — analyst effort is never silently discarded. The store is pluggable behind StateStoreBase (storage.backend): the file StateStore (JSON, atomic writes) or the DB-backed SqlStateStore (SQLAlchemy -&gt; Postgres/SQLite) for shared HA use, with concurrency-safe writes (a manual decision always wins; a machine proposal never overwrites a manual/terminal row).</w:t>
+        <w:t xml:space="preserve">Internal lifecycle mapped to ServiceNow VR states on export: new -&gt; under_investigation -&gt; confirmed / false_positive / risk_accepted / duplicate / resolved. The pipeline proposes a conservative initial state; a human confirms or overrides. Persistence is the important property: the StateStore persists each decision keyed by fingerprint, tags whether a human set it, and freezes a machine-belief snapshot — the risk score, AI exploitability score, EPSS, KEV, reachability, severity, and repo the pipeline held at record time, plus a decided_at timestamp. Manual entries are never overwritten by machine records, so an analyst decision keeps the prediction it was made against — the ground truth the calibration report (5.7b) grades. On rescan, any manual decision or terminal closure is honored and never re-opened — analyst effort is never silently discarded. The store is pluggable behind StateStoreBase (storage.backend): the file StateStore (JSON, atomic writes) or the DB-backed SqlStateStore (SQLAlchemy -&gt; Postgres/SQLite) for shared HA use, with concurrency-safe writes (a manual decision always wins; a machine proposal never overwrites a manual/terminal row). Pre-snapshot entries still load: the file store tolerates absent keys and the SQL store applies ADD COLUMN migrations on open.</w:t>
       </w:r>
     </w:p>
     <w:p>
@@ -2698,7 +2698,7 @@
         <w:spacing w:after="80" w:before="180"/>
       </w:pPr>
       <w:r>
-        <w:t xml:space="preserve">5.8 ServiceNow export (servicenow.py)</w:t>
+        <w:t xml:space="preserve">5.7b Calibration report (calibration.py)</w:t>
       </w:r>
     </w:p>
     <w:p>
@@ -2706,7 +2706,7 @@
         <w:spacing w:after="120"/>
       </w:pPr>
       <w:r>
-        <w:t xml:space="preserve">Builds sn_vul_vulnerable_item records, highest-risk first, carrying the composite score, risk rating, validation state, and the exploitability rationale plus attack-chain context in the work notes — so a responder sees why the tool ranked it. correlation_id is the fingerprint, making the import idempotent: re-runs upsert the same item and closed items stay closed. Output is written to a file — JSON (servicenow_import.json) or, when servicenow.format is csv, a CSV (servicenow_import.csv) for CSV Import Sets, with multi-line work notes quoted correctly — or POSTed to the import table via the Table API. The format is settable in config, the config UI, or with --sn-format on the CLI.</w:t>
+        <w:t xml:space="preserve">The feedback prior adapts scores; the calibration report measures whether the scores were right to begin with. It joins each manual confirmed / false_positive decision to the machine-belief snapshot frozen with it (5.7) and reports: the confirm rate by predicted-score bucket (0-39 / 40-59 / 60-79 / 80-100) — rising with the bucket means the composite score predicts analyst outcomes, flat or inverted means the weights or the AI stage need work; the score separation (mean predicted score of confirmed vs false-positive decisions); and the noisiest keys — CWE families/components whose manual history is dominated by false positives (the same keys the feedback prior nudges), a concrete scanner-tuning worklist. Like the prior, it uses only accuracy states, and it is read-only — it changes nothing, it grades. Decisions persisted before snapshots existed count toward totals but cannot be bucketed (reported as unscored). Surfaced as GET /api/calibration, the UI Calibration tab, and codescan calibration on the CLI. Because the snapshot captures what the configured pipeline predicted, the report also makes provider/model routing changes (5.5) empirically comparable over time.</w:t>
       </w:r>
     </w:p>
     <w:p>
@@ -2715,6 +2715,23 @@
         <w:spacing w:after="80" w:before="180"/>
       </w:pPr>
       <w:r>
+        <w:t xml:space="preserve">5.8 ServiceNow export (servicenow.py)</w:t>
+      </w:r>
+    </w:p>
+    <w:p>
+      <w:pPr>
+        <w:spacing w:after="120"/>
+      </w:pPr>
+      <w:r>
+        <w:t xml:space="preserve">Builds sn_vul_vulnerable_item records, highest-risk first, carrying the composite score, risk rating, validation state, and the exploitability rationale plus attack-chain context in the work notes — so a responder sees why the tool ranked it. correlation_id is the fingerprint, making the import idempotent: re-runs upsert the same item and closed items stay closed. Output is written to a file — JSON (servicenow_import.json) or, when servicenow.format is csv, a CSV (servicenow_import.csv) for CSV Import Sets, with multi-line work notes quoted correctly — or POSTed to the import table via the Table API. The format is settable in config, the config UI, or with --sn-format on the CLI.</w:t>
+      </w:r>
+    </w:p>
+    <w:p>
+      <w:pPr>
+        <w:pStyle w:val="Heading2"/>
+        <w:spacing w:after="80" w:before="180"/>
+      </w:pPr>
+      <w:r>
         <w:t xml:space="preserve">5.9 Web UI (web.py + static/index.html)</w:t>
       </w:r>
     </w:p>
@@ -2723,7 +2740,7 @@
         <w:spacing w:after="120"/>
       </w:pPr>
       <w:r>
-        <w:t xml:space="preserve">A FastAPI backend holds the latest result in memory; the frontend is a single dependency-free HTML page with four views, plus GET /api/export for JSON/CSV downloads. Overview: the landing page — run status (source, mode, last run), key metrics, a severity breakdown, quick actions (run, download JSON/CSV, jump to a tab), and an in-app usage guide, making the UI a complete usage surface with no CLI required. Findings: the triage queue with filters, signal badges, a per-finding detail drawer (CVSS vector, EPSS, reachability, provenance, rationale, remediation, tags, threats, chains), and inline validation-state editing that persists to the persistent store.</w:t>
+        <w:t xml:space="preserve">A FastAPI backend holds the latest result in memory; the frontend is a single dependency-free HTML page, plus GET /api/export for JSON/CSV downloads. Overview: the landing page — run status (source, mode, last run), key metrics, a severity breakdown, quick actions (run, download JSON/CSV, jump to a tab), and an in-app usage guide, making the UI a complete usage surface with no CLI required. Findings: the triage queue with filters, signal badges, a per-finding detail drawer (CVSS vector, EPSS, reachability, provenance, rationale, remediation, tags, threats, chains), and inline validation-state editing that persists to the persistent store.</w:t>
       </w:r>
     </w:p>
     <w:p>
@@ -2732,6 +2749,14 @@
       </w:pPr>
       <w:r>
         <w:t xml:space="preserve">Threats: the per-service threat models (5.10) — STRIDE threats with linked findings/chains, assets, entry points, trust boundaries, posture, and recommendations.</w:t>
+      </w:r>
+    </w:p>
+    <w:p>
+      <w:pPr>
+        <w:spacing w:after="120"/>
+      </w:pPr>
+      <w:r>
+        <w:t xml:space="preserve">Calibration: the score-calibration report (5.7b) — confirm rate by predicted-score bucket, score separation, and the noisiest weakness families/components, via GET /api/calibration.</w:t>
       </w:r>
     </w:p>
     <w:p>
@@ -4865,20 +4890,33 @@
         <w:spacing w:after="40"/>
       </w:pPr>
       <w:r>
-        <w:t xml:space="preserve">State store (tests/test_validation.py) — atomic save round-trip, no temp leftover, crash-during-replace preserves the existing file.</w:t>
-      </w:r>
-    </w:p>
-    <w:p>
-      <w:pPr>
-        <w:pStyle w:val="ListParagraph"/>
-        <w:numPr>
-          <w:ilvl w:val="0"/>
-          <w:numId w:val="1"/>
-        </w:numPr>
-        <w:spacing w:after="40"/>
-      </w:pPr>
-      <w:r>
-        <w:t xml:space="preserve">SQL state store (tests/test_state_store_sql.py) — backend factory, round-trip/persistence, manual-not-clobbered-by-machine concurrency guard, feedback over SQL, and a pipeline run persisting to SQLite.</w:t>
+        <w:t xml:space="preserve">State store (tests/test_validation.py) — atomic save round-trip, no temp leftover, crash-during-replace preserves the existing file, machine-belief snapshot capture, legacy (pre-snapshot) entries loading cleanly.</w:t>
+      </w:r>
+    </w:p>
+    <w:p>
+      <w:pPr>
+        <w:pStyle w:val="ListParagraph"/>
+        <w:numPr>
+          <w:ilvl w:val="0"/>
+          <w:numId w:val="1"/>
+        </w:numPr>
+        <w:spacing w:after="40"/>
+      </w:pPr>
+      <w:r>
+        <w:t xml:space="preserve">SQL state store (tests/test_state_store_sql.py) — backend factory, round-trip/persistence (incl. snapshots), manual-not-clobbered-by-machine concurrency guard, the pre-snapshot schema upgrading in place, feedback over SQL, and a pipeline run persisting to SQLite.</w:t>
+      </w:r>
+    </w:p>
+    <w:p>
+      <w:pPr>
+        <w:pStyle w:val="ListParagraph"/>
+        <w:numPr>
+          <w:ilvl w:val="0"/>
+          <w:numId w:val="1"/>
+        </w:numPr>
+        <w:spacing w:after="40"/>
+      </w:pPr>
+      <w:r>
+        <w:t xml:space="preserve">Calibration (tests/test_calibration.py) — bucket/rate math, accuracy states only, noisy-key surfacing, legacy decisions counted but unbucketed, and the empty-store zeroed report; endpoint coverage in test_web.py.</w:t>
       </w:r>
     </w:p>
     <w:p>

</xml_diff>

<commit_message>
feat: feed triage history into the exploitability prompt
New TriageHistory (feedback.py) packages the org's manual
confirmed/false-positive decisions on similar findings (same CWE
family or component, self-excluded) as a per-finding
prior_analyst_decisions fact in the exploitability digest. The system
prompt frames it as organizational context, not a verdict — weighed
where it transfers, explained in the rationale, never overriding KEV
or reachability. Complements the post-hoc score prior by putting the
same ground truth into the model's reasoning.

Gated by feedback.prompt_history (default on) in config and the UI
Config tab; the pipeline now opens the state store before the AI
stage and reuses it for the prior and state persistence.

Co-Authored-By: Claude Fable 5 <noreply@anthropic.com>
</commit_message>
<xml_diff>
--- a/docs/DESIGN.docx
+++ b/docs/DESIGN.docx
@@ -1840,6 +1840,19 @@
         <w:spacing w:after="40"/>
       </w:pPr>
       <w:r>
+        <w:t xml:space="preserve">Triage history as a grounded fact (feedback.prompt_history, default on) — a finding's digest gains prior_analyst_decisions: counts of how this org's analysts triaged similar findings (same CWE family / component), built from the state store (TriageHistory). The system prompt frames it as organizational context, not a verdict — weighed where it transfers, noted in the rationale, never overriding KEV or reachability. Complements the post-hoc score prior (5.7a) by putting the same ground truth into the reasoning.</w:t>
+      </w:r>
+    </w:p>
+    <w:p>
+      <w:pPr>
+        <w:pStyle w:val="ListParagraph"/>
+        <w:numPr>
+          <w:ilvl w:val="0"/>
+          <w:numId w:val="1"/>
+        </w:numPr>
+        <w:spacing w:after="40"/>
+      </w:pPr>
+      <w:r>
         <w:t xml:space="preserve">Structured output — a JSON Schema guarantees a parseable response; no prompt-scraping.</w:t>
       </w:r>
     </w:p>
@@ -2689,7 +2702,7 @@
         <w:spacing w:after="120"/>
       </w:pPr>
       <w:r>
-        <w:t xml:space="preserve">The persisted validation decisions are also a training signal. Before export, apply_feedback builds a prior from the manual confirmed (true positive) and false_positive decisions in the state store, aggregated by weakness family (CWE) and component. A new finding sharing a trait the org has repeatedly dismissed is nudged down; one repeatedly confirmed, up — so the scanner adapts to this estate rather than scoring every run identically. Conservative and explainable: capped (max_adjust), gated on a minimum sample (min_evidence), scales with consensus, a finding never adjusts itself, only accuracy states count (not risk_accepted/resolved), it moves only the machine score (never the analyst's state), and a KEV finding is never pushed below kev_floor. Each adjusted finding records the reason in its rationale + a feedback-adjusted tag, and the scan's audit event carries the adjusted count.</w:t>
+        <w:t xml:space="preserve">The persisted validation decisions are also a training signal. Before export, apply_feedback builds a prior from the manual confirmed (true positive) and false_positive decisions in the state store, aggregated by weakness family (CWE) and component. A new finding sharing a trait the org has repeatedly dismissed is nudged down; one repeatedly confirmed, up — so the scanner adapts to this estate rather than scoring every run identically. Conservative and explainable: capped (max_adjust), gated on a minimum sample (min_evidence), scales with consensus, a finding never adjusts itself, only accuracy states count (not risk_accepted/resolved), it moves only the machine score (never the analyst's state), and a KEV finding is never pushed below kev_floor. Each adjusted finding records the reason in its rationale + a feedback-adjusted tag, and the scan's audit event carries the adjusted count. The same history also reaches the model directly: TriageHistory packages per-finding confirmed/false-positive counts for the exploitability prompt (5.4, feedback.prompt_history). The two mechanisms are complementary — the prompt context lets the model reason with the org's ground truth (and discount it when it doesn't transfer), while the score prior remains a deterministic, bounded backstop that works even when the AI stage is off.</w:t>
       </w:r>
     </w:p>
     <w:p>
@@ -4968,7 +4981,20 @@
         <w:spacing w:after="40"/>
       </w:pPr>
       <w:r>
-        <w:t xml:space="preserve">Feedback loop (tests/test_feedback.py) — false-positive history lowers / confirmed raises the score, min-evidence gate, self-exclusion, KEV-floor respect, disabled no-op, accuracy-states-only, store attribute round-trip.</w:t>
+        <w:t xml:space="preserve">Feedback loop (tests/test_feedback.py) — false-positive history lowers / confirmed raises the score, min-evidence gate, self-exclusion, KEV-floor respect, disabled no-op, accuracy-states-only, store attribute round-trip, and TriageHistory prompt-context counts.</w:t>
+      </w:r>
+    </w:p>
+    <w:p>
+      <w:pPr>
+        <w:pStyle w:val="ListParagraph"/>
+        <w:numPr>
+          <w:ilvl w:val="0"/>
+          <w:numId w:val="1"/>
+        </w:numPr>
+        <w:spacing w:after="40"/>
+      </w:pPr>
+      <w:r>
+        <w:t xml:space="preserve">Exploitability engine (tests/test_exploitability.py) — fake-LLM prompt assembly: results applied to findings/chains, prior_analyst_decisions carried with the right counts, omitted when there's no history or the feature is off.</w:t>
       </w:r>
     </w:p>
     <w:p>
@@ -5094,7 +5120,7 @@
         <w:spacing w:after="40"/>
       </w:pPr>
       <w:r>
-        <w:t xml:space="preserve">feedback — analyst-feedback score prior: enabled, max_adjust, min_evidence.</w:t>
+        <w:t xml:space="preserve">feedback — analyst-feedback loop: enabled, max_adjust, min_evidence (score prior), prompt_history (triage history into the AI prompt).</w:t>
       </w:r>
     </w:p>
     <w:p>

</xml_diff>

<commit_message>
feat: capture the analyst's one-line rationale with each triage decision
Manual validation decisions can now carry an optional free-text note
(why), persisted in both state stores (file + SQL, with an in-place
ADD COLUMN migration), recorded in the audit event, and returned as
analyst_note in the web API. The Findings drawer gains a Triage
section (state + note + Apply) that prefills the existing note; quick
row-level state changes preserve it.

TriageHistory now carries up to three most-recent notes, labeled with
their outcome, alongside the confirmed/false-positive counts in the
exploitability prompt — turning bare precedent counts into
transferable reasoning ('false_positive: vendored test fixture' tells
the model when the precedent applies).

Co-Authored-By: Claude Fable 5 <noreply@anthropic.com>
</commit_message>
<xml_diff>
--- a/docs/DESIGN.docx
+++ b/docs/DESIGN.docx
@@ -2685,7 +2685,7 @@
         <w:spacing w:after="120"/>
       </w:pPr>
       <w:r>
-        <w:t xml:space="preserve">Internal lifecycle mapped to ServiceNow VR states on export: new -&gt; under_investigation -&gt; confirmed / false_positive / risk_accepted / duplicate / resolved. The pipeline proposes a conservative initial state; a human confirms or overrides. Persistence is the important property: the StateStore persists each decision keyed by fingerprint, tags whether a human set it, and freezes a machine-belief snapshot — the risk score, AI exploitability score, EPSS, KEV, reachability, severity, and repo the pipeline held at record time, plus a decided_at timestamp. Manual entries are never overwritten by machine records, so an analyst decision keeps the prediction it was made against — the ground truth the calibration report (5.7b) grades. On rescan, any manual decision or terminal closure is honored and never re-opened — analyst effort is never silently discarded. The store is pluggable behind StateStoreBase (storage.backend): the file StateStore (JSON, atomic writes) or the DB-backed SqlStateStore (SQLAlchemy -&gt; Postgres/SQLite) for shared HA use, with concurrency-safe writes (a manual decision always wins; a machine proposal never overwrites a manual/terminal row). Pre-snapshot entries still load: the file store tolerates absent keys and the SQL store applies ADD COLUMN migrations on open.</w:t>
+        <w:t xml:space="preserve">Internal lifecycle mapped to ServiceNow VR states on export: new -&gt; under_investigation -&gt; confirmed / false_positive / risk_accepted / duplicate / resolved. The pipeline proposes a conservative initial state; a human confirms or overrides. Persistence is the important property: the StateStore persists each decision keyed by fingerprint, tags whether a human set it, freezes a machine-belief snapshot — the risk score, AI exploitability score, EPSS, KEV, reachability, severity, and repo the pipeline held at record time — plus a decided_at timestamp and the analyst's optional one-line note (why). Manual entries are never overwritten by machine records, so an analyst decision keeps the prediction it was made against — the ground truth the calibration report (5.7b) grades. On rescan, any manual decision or terminal closure is honored and never re-opened — analyst effort is never silently discarded. The store is pluggable behind StateStoreBase (storage.backend): the file StateStore (JSON, atomic writes) or the DB-backed SqlStateStore (SQLAlchemy -&gt; Postgres/SQLite) for shared HA use, with concurrency-safe writes (a manual decision always wins; a machine proposal never overwrites a manual/terminal row). Pre-snapshot entries still load: the file store tolerates absent keys and the SQL store applies ADD COLUMN migrations on open.</w:t>
       </w:r>
     </w:p>
     <w:p>
@@ -2702,7 +2702,7 @@
         <w:spacing w:after="120"/>
       </w:pPr>
       <w:r>
-        <w:t xml:space="preserve">The persisted validation decisions are also a training signal. Before export, apply_feedback builds a prior from the manual confirmed (true positive) and false_positive decisions in the state store, aggregated by weakness family (CWE) and component. A new finding sharing a trait the org has repeatedly dismissed is nudged down; one repeatedly confirmed, up — so the scanner adapts to this estate rather than scoring every run identically. Conservative and explainable: capped (max_adjust), gated on a minimum sample (min_evidence), scales with consensus, a finding never adjusts itself, only accuracy states count (not risk_accepted/resolved), it moves only the machine score (never the analyst's state), and a KEV finding is never pushed below kev_floor. Each adjusted finding records the reason in its rationale + a feedback-adjusted tag, and the scan's audit event carries the adjusted count. The same history also reaches the model directly: TriageHistory packages per-finding confirmed/false-positive counts for the exploitability prompt (5.4, feedback.prompt_history). The two mechanisms are complementary — the prompt context lets the model reason with the org's ground truth (and discount it when it doesn't transfer), while the score prior remains a deterministic, bounded backstop that works even when the AI stage is off.</w:t>
+        <w:t xml:space="preserve">The persisted validation decisions are also a training signal. Before export, apply_feedback builds a prior from the manual confirmed (true positive) and false_positive decisions in the state store, aggregated by weakness family (CWE) and component. A new finding sharing a trait the org has repeatedly dismissed is nudged down; one repeatedly confirmed, up — so the scanner adapts to this estate rather than scoring every run identically. Conservative and explainable: capped (max_adjust), gated on a minimum sample (min_evidence), scales with consensus, a finding never adjusts itself, only accuracy states count (not risk_accepted/resolved), it moves only the machine score (never the analyst's state), and a KEV finding is never pushed below kev_floor. Each adjusted finding records the reason in its rationale + a feedback-adjusted tag, and the scan's audit event carries the adjusted count. The same history also reaches the model directly: TriageHistory packages per-finding confirmed/false-positive counts — plus up to three most-recent analyst notes labeled with their outcome — for the exploitability prompt (5.4, feedback.prompt_history). The notes make the history transferable: 'false_positive: vendored test fixture' tells the model when the precedent applies, where a bare count can't. The two mechanisms are complementary — the prompt context lets the model reason with the org's ground truth (and discount it when it doesn't transfer), while the score prior remains a deterministic, bounded backstop that works even when the AI stage is off.</w:t>
       </w:r>
     </w:p>
     <w:p>
@@ -2753,7 +2753,7 @@
         <w:spacing w:after="120"/>
       </w:pPr>
       <w:r>
-        <w:t xml:space="preserve">A FastAPI backend holds the latest result in memory; the frontend is a single dependency-free HTML page, plus GET /api/export for JSON/CSV downloads. Overview: the landing page — run status (source, mode, last run), key metrics, a severity breakdown, quick actions (run, download JSON/CSV, jump to a tab), and an in-app usage guide, making the UI a complete usage surface with no CLI required. Findings: the triage queue with filters, signal badges, a per-finding detail drawer (CVSS vector, EPSS, reachability, provenance, rationale, remediation, tags, threats, chains), and inline validation-state editing that persists to the persistent store.</w:t>
+        <w:t xml:space="preserve">A FastAPI backend holds the latest result in memory; the frontend is a single dependency-free HTML page, plus GET /api/export for JSON/CSV downloads. Overview: the landing page — run status (source, mode, last run), key metrics, a severity breakdown, quick actions (run, download JSON/CSV, jump to a tab), and an in-app usage guide, making the UI a complete usage surface with no CLI required. Findings: the triage queue with filters, signal badges, a per-finding detail drawer (CVSS vector, EPSS, reachability, provenance, rationale, remediation, tags, threats, chains), and inline validation-state editing that persists to the persistent store; the drawer's Triage section takes an optional one-line note with the decision — persisted, audited, and fed to the AI on similar findings.</w:t>
       </w:r>
     </w:p>
     <w:p>
@@ -4903,7 +4903,7 @@
         <w:spacing w:after="40"/>
       </w:pPr>
       <w:r>
-        <w:t xml:space="preserve">State store (tests/test_validation.py) — atomic save round-trip, no temp leftover, crash-during-replace preserves the existing file, machine-belief snapshot capture, legacy (pre-snapshot) entries loading cleanly.</w:t>
+        <w:t xml:space="preserve">State store (tests/test_validation.py) — atomic save round-trip, no temp leftover, crash-during-replace preserves the existing file, machine-belief snapshot capture, analyst-note round-trip, legacy (pre-snapshot) entries loading cleanly.</w:t>
       </w:r>
     </w:p>
     <w:p>
@@ -4981,7 +4981,7 @@
         <w:spacing w:after="40"/>
       </w:pPr>
       <w:r>
-        <w:t xml:space="preserve">Feedback loop (tests/test_feedback.py) — false-positive history lowers / confirmed raises the score, min-evidence gate, self-exclusion, KEV-floor respect, disabled no-op, accuracy-states-only, store attribute round-trip, and TriageHistory prompt-context counts.</w:t>
+        <w:t xml:space="preserve">Feedback loop (tests/test_feedback.py) — false-positive history lowers / confirmed raises the score, min-evidence gate, self-exclusion, KEV-floor respect, disabled no-op, accuracy-states-only, store attribute round-trip, and TriageHistory prompt-context counts and analyst notes (labeled, capped).</w:t>
       </w:r>
     </w:p>
     <w:p>

</xml_diff>

<commit_message>
feat: weight the feedback prior's evidence — shrinkage, time decay, repo scoping
The analyst-feedback prior now weights each prior decision instead of
counting it: delta = max_adjust * (W+ - W-) / (W+ + W- + shrinkage).
A shrinkage pseudo-count makes confidence grow with evidence volume
(two unanimous decisions nudge, twenty approach the cap), a decision's
weight halves every feedback.half_life_days (legacy entries without a
timestamp count as one half-life old), and decisions made in the same
repo as the new finding are boosted by feedback.same_repo_boost.
Rationale text now says the adjustment is recency- and repo-weighted.

New config knobs (shrinkage 3 / half_life_days 180 / same_repo_boost 2
by default; shrinkage 0 + half_life_days 0 restores raw consensus).

Co-Authored-By: Claude Fable 5 <noreply@anthropic.com>
</commit_message>
<xml_diff>
--- a/docs/DESIGN.docx
+++ b/docs/DESIGN.docx
@@ -2702,7 +2702,7 @@
         <w:spacing w:after="120"/>
       </w:pPr>
       <w:r>
-        <w:t xml:space="preserve">The persisted validation decisions are also a training signal. Before export, apply_feedback builds a prior from the manual confirmed (true positive) and false_positive decisions in the state store, aggregated by weakness family (CWE) and component. A new finding sharing a trait the org has repeatedly dismissed is nudged down; one repeatedly confirmed, up — so the scanner adapts to this estate rather than scoring every run identically. Conservative and explainable: capped (max_adjust), gated on a minimum sample (min_evidence), scales with consensus, a finding never adjusts itself, only accuracy states count (not risk_accepted/resolved), it moves only the machine score (never the analyst's state), and a KEV finding is never pushed below kev_floor. Each adjusted finding records the reason in its rationale + a feedback-adjusted tag, and the scan's audit event carries the adjusted count. The same history also reaches the model directly: TriageHistory packages per-finding confirmed/false-positive counts — plus up to three most-recent analyst notes labeled with their outcome — for the exploitability prompt (5.4, feedback.prompt_history). The notes make the history transferable: 'false_positive: vendored test fixture' tells the model when the precedent applies, where a bare count can't. The two mechanisms are complementary — the prompt context lets the model reason with the org's ground truth (and discount it when it doesn't transfer), while the score prior remains a deterministic, bounded backstop that works even when the AI stage is off.</w:t>
+        <w:t xml:space="preserve">The persisted validation decisions are also a training signal. Before export, apply_feedback builds a prior from the manual confirmed (true positive) and false_positive decisions in the state store, aggregated by weakness family (CWE) and component. A new finding sharing a trait the org has repeatedly dismissed is nudged down; one repeatedly confirmed, up — so the scanner adapts to this estate rather than scoring every run identically. Conservative and explainable: capped (max_adjust), gated on a minimum sample (min_evidence), a finding never adjusts itself, only accuracy states count (not risk_accepted/resolved), it moves only the machine score (never the analyst's state), and a KEV finding is never pushed below kev_floor. Evidence is weighted, not just counted — delta = max_adjust * (W+ - W-) / (W+ + W- + shrinkage), each decision's weight decayed by age (halving every half_life_days) and boosted when made in the same repo as the new finding (same_repo_boost); the shrinkage pseudo-count keeps thin evidence humble (two unanimous decisions nudge, twenty approach the cap). Each adjusted finding records the reason in its rationale + a feedback-adjusted tag, and the scan's audit event carries the adjusted count. The same history also reaches the model directly: TriageHistory packages per-finding confirmed/false-positive counts — plus up to three most-recent analyst notes labeled with their outcome — for the exploitability prompt (5.4, feedback.prompt_history). The notes make the history transferable: 'false_positive: vendored test fixture' tells the model when the precedent applies, where a bare count can't. The two mechanisms are complementary — the prompt context lets the model reason with the org's ground truth (and discount it when it doesn't transfer), while the score prior remains a deterministic, bounded backstop that works even when the AI stage is off.</w:t>
       </w:r>
     </w:p>
     <w:p>
@@ -4981,7 +4981,7 @@
         <w:spacing w:after="40"/>
       </w:pPr>
       <w:r>
-        <w:t xml:space="preserve">Feedback loop (tests/test_feedback.py) — false-positive history lowers / confirmed raises the score, min-evidence gate, self-exclusion, KEV-floor respect, disabled no-op, accuracy-states-only, store attribute round-trip, and TriageHistory prompt-context counts and analyst notes (labeled, capped).</w:t>
+        <w:t xml:space="preserve">Feedback loop (tests/test_feedback.py) — false-positive history lowers / confirmed raises the score, min-evidence gate, self-exclusion, KEV-floor respect, disabled no-op, accuracy-states-only, store attribute round-trip, evidence weighting (shrinkage growth, time decay, same-repo boost), and TriageHistory prompt-context counts and analyst notes (labeled, capped).</w:t>
       </w:r>
     </w:p>
     <w:p>
@@ -5120,7 +5120,7 @@
         <w:spacing w:after="40"/>
       </w:pPr>
       <w:r>
-        <w:t xml:space="preserve">feedback — analyst-feedback loop: enabled, max_adjust, min_evidence (score prior), prompt_history (triage history into the AI prompt).</w:t>
+        <w:t xml:space="preserve">feedback — analyst-feedback loop: enabled, max_adjust, min_evidence, shrinkage, half_life_days, same_repo_boost (score prior), prompt_history (triage history into the AI prompt).</w:t>
       </w:r>
     </w:p>
     <w:p>

</xml_diff>

<commit_message>
feat: validation states for attack chains — confirm/dismiss the paths
Chains — the pipeline's most speculative output — now have a feedback
loop. Each chain carries a stable finding-set fingerprint
(chain_fingerprint, models.py), and analysts confirm or dismiss it
(new/confirmed/false_positive; lifecycle states rejected) via
POST /api/chains/{fingerprint}/state or the select on every chain
card. Decisions persist in the state store under chain:<fingerprint>
keys, are audited, and re-apply on rescan via annotate_chain_states.

A dismissed chain stays in the result (dimmed, reversible in the UI)
but active_chains excludes it from scoring, threat modeling, and the
ServiceNow export. Finding-oriented consumers (feedback prior,
calibration, analyst notes) skip chain keys.

Co-Authored-By: Claude Fable 5 <noreply@anthropic.com>
</commit_message>
<xml_diff>
--- a/docs/DESIGN.docx
+++ b/docs/DESIGN.docx
@@ -2685,7 +2685,7 @@
         <w:spacing w:after="120"/>
       </w:pPr>
       <w:r>
-        <w:t xml:space="preserve">Internal lifecycle mapped to ServiceNow VR states on export: new -&gt; under_investigation -&gt; confirmed / false_positive / risk_accepted / duplicate / resolved. The pipeline proposes a conservative initial state; a human confirms or overrides. Persistence is the important property: the StateStore persists each decision keyed by fingerprint, tags whether a human set it, freezes a machine-belief snapshot — the risk score, AI exploitability score, EPSS, KEV, reachability, severity, and repo the pipeline held at record time — plus a decided_at timestamp and the analyst's optional one-line note (why). Manual entries are never overwritten by machine records, so an analyst decision keeps the prediction it was made against — the ground truth the calibration report (5.7b) grades. On rescan, any manual decision or terminal closure is honored and never re-opened — analyst effort is never silently discarded. The store is pluggable behind StateStoreBase (storage.backend): the file StateStore (JSON, atomic writes) or the DB-backed SqlStateStore (SQLAlchemy -&gt; Postgres/SQLite) for shared HA use, with concurrency-safe writes (a manual decision always wins; a machine proposal never overwrites a manual/terminal row). Pre-snapshot entries still load: the file store tolerates absent keys and the SQL store applies ADD COLUMN migrations on open.</w:t>
+        <w:t xml:space="preserve">Internal lifecycle mapped to ServiceNow VR states on export: new -&gt; under_investigation -&gt; confirmed / false_positive / risk_accepted / duplicate / resolved. The pipeline proposes a conservative initial state; a human confirms or overrides. Persistence is the important property: the StateStore persists each decision keyed by fingerprint, tags whether a human set it, freezes a machine-belief snapshot — the risk score, AI exploitability score, EPSS, KEV, reachability, severity, and repo the pipeline held at record time — plus a decided_at timestamp and the analyst's optional one-line note (why). Manual entries are never overwritten by machine records, so an analyst decision keeps the prediction it was made against — the ground truth the calibration report (5.7b) grades. On rescan, any manual decision or terminal closure is honored and never re-opened — analyst effort is never silently discarded. The store is pluggable behind StateStoreBase (storage.backend): the file StateStore (JSON, atomic writes) or the DB-backed SqlStateStore (SQLAlchemy -&gt; Postgres/SQLite) for shared HA use, with concurrency-safe writes (a manual decision always wins; a machine proposal never overwrites a manual/terminal row). Pre-snapshot entries still load: the file store tolerates absent keys and the SQL store applies ADD COLUMN migrations on open. Attack chains have a lifecycle too: analysts confirm or dismiss a chain (new / confirmed / false_positive), persisted under a chain:&lt;fingerprint&gt; key — the fingerprint hashes the chain's finding set, stable across runs where model-assigned chain ids are not — and re-applied on every scan. A dismissed chain stays in the result (visible, reversible) but is excluded from scoring, threat modeling, and the ServiceNow export; finding-oriented consumers (feedback prior, calibration) skip chain keys.</w:t>
       </w:r>
     </w:p>
     <w:p>
@@ -4903,7 +4903,7 @@
         <w:spacing w:after="40"/>
       </w:pPr>
       <w:r>
-        <w:t xml:space="preserve">State store (tests/test_validation.py) — atomic save round-trip, no temp leftover, crash-during-replace preserves the existing file, machine-belief snapshot capture, analyst-note round-trip, legacy (pre-snapshot) entries loading cleanly.</w:t>
+        <w:t xml:space="preserve">State store (tests/test_validation.py) — atomic save round-trip, no temp leftover, crash-during-replace preserves the existing file, machine-belief snapshot capture, analyst-note round-trip, legacy (pre-snapshot) entries loading cleanly, and chain decisions (round-trip, annotation, dismissed-chain exclusion, lifecycle states rejected).</w:t>
       </w:r>
     </w:p>
     <w:p>

</xml_diff>

<commit_message>
feat: calibration drift alerting — the report becomes a monitoring control
drift_alerts() (calibration.py) runs threshold checks over the
calibration report: high-score precision (80-100 bucket confirm rate
below min_high_confirm_rate) and score separation (confirmed-vs-FP
mean-score gap below min_separation), each gated on
min_bucket_decisions of evidence so a cold store stays silent. After
every scan the pipeline re-grades the accumulated history and emits a
calibration.drift audit event per alert — fanning out to the SIEM
sinks — plus a log warning. Alerts also ride GET /api/calibration
(red banner in the Calibration tab) and the codescan calibration CLI.

New calibration: config section (alerts_enabled toggle also in the
UI Config tab).

Co-Authored-By: Claude Fable 5 <noreply@anthropic.com>
</commit_message>
<xml_diff>
--- a/docs/DESIGN.docx
+++ b/docs/DESIGN.docx
@@ -2719,7 +2719,7 @@
         <w:spacing w:after="120"/>
       </w:pPr>
       <w:r>
-        <w:t xml:space="preserve">The feedback prior adapts scores; the calibration report measures whether the scores were right to begin with. It joins each manual confirmed / false_positive decision to the machine-belief snapshot frozen with it (5.7) and reports: the confirm rate by predicted-score bucket (0-39 / 40-59 / 60-79 / 80-100) — rising with the bucket means the composite score predicts analyst outcomes, flat or inverted means the weights or the AI stage need work; the score separation (mean predicted score of confirmed vs false-positive decisions); and the noisiest keys — CWE families/components whose manual history is dominated by false positives (the same keys the feedback prior nudges), a concrete scanner-tuning worklist. Like the prior, it uses only accuracy states, and it is read-only — it changes nothing, it grades. Decisions persisted before snapshots existed count toward totals but cannot be bucketed (reported as unscored). Surfaced as GET /api/calibration, the UI Calibration tab, and codescan calibration on the CLI. Because the snapshot captures what the configured pipeline predicted, the report also makes provider/model routing changes (5.5) empirically comparable over time.</w:t>
+        <w:t xml:space="preserve">The feedback prior adapts scores; the calibration report measures whether the scores were right to begin with. It joins each manual confirmed / false_positive decision to the machine-belief snapshot frozen with it (5.7) and reports: the confirm rate by predicted-score bucket (0-39 / 40-59 / 60-79 / 80-100) — rising with the bucket means the composite score predicts analyst outcomes, flat or inverted means the weights or the AI stage need work; the score separation (mean predicted score of confirmed vs false-positive decisions); and the noisiest keys — CWE families/components whose manual history is dominated by false positives (the same keys the feedback prior nudges), a concrete scanner-tuning worklist. Like the prior, it uses only accuracy states, and it is read-only — it changes nothing, it grades. Decisions persisted before snapshots existed count toward totals but cannot be bucketed (reported as unscored). Surfaced as GET /api/calibration, the UI Calibration tab, and codescan calibration on the CLI. Because the snapshot captures what the configured pipeline predicted, the report also makes provider/model routing changes (5.5) empirically comparable over time. Drift alerting (thresholds in the calibration config section) turns the pull-based report into a continuous-monitoring control: after each scan the pipeline re-grades the history and raises a calibration.drift audit event — fanning out to the SIEM sinks — when the 80-100 bucket's confirm rate falls below min_high_confirm_rate or the confirmed-vs-false-positive mean-score gap falls below min_separation; both checks stay silent below min_bucket_decisions of evidence, so a cold store can't page anyone. Alerts also surface in the Calibration tab and the CLI report.</w:t>
       </w:r>
     </w:p>
     <w:p>
@@ -4929,7 +4929,7 @@
         <w:spacing w:after="40"/>
       </w:pPr>
       <w:r>
-        <w:t xml:space="preserve">Calibration (tests/test_calibration.py) — bucket/rate math, accuracy states only, noisy-key surfacing, legacy decisions counted but unbucketed, and the empty-store zeroed report; endpoint coverage in test_web.py.</w:t>
+        <w:t xml:space="preserve">Calibration (tests/test_calibration.py) — bucket/rate math, accuracy states only, noisy-key surfacing, legacy decisions counted but unbucketed, chain decisions excluded, the empty-store zeroed report, and drift alerts (precision + separation checks, evidence gate, disabled/healthy silence); endpoint coverage in test_web.py and the scan-time calibration.drift audit event in test_pipeline.py.</w:t>
       </w:r>
     </w:p>
     <w:p>
@@ -5121,6 +5121,19 @@
       </w:pPr>
       <w:r>
         <w:t xml:space="preserve">feedback — analyst-feedback loop: enabled, max_adjust, min_evidence, shrinkage, half_life_days, same_repo_boost (score prior), prompt_history (triage history into the AI prompt).</w:t>
+      </w:r>
+    </w:p>
+    <w:p>
+      <w:pPr>
+        <w:pStyle w:val="ListParagraph"/>
+        <w:numPr>
+          <w:ilvl w:val="0"/>
+          <w:numId w:val="1"/>
+        </w:numPr>
+        <w:spacing w:after="40"/>
+      </w:pPr>
+      <w:r>
+        <w:t xml:space="preserve">calibration — drift alerting: alerts_enabled, min_bucket_decisions, min_high_confirm_rate, min_separation.</w:t>
       </w:r>
     </w:p>
     <w:p>

</xml_diff>

<commit_message>
docs: clarity pass — replace informal phrasing with plain language
Reviewed README, DESIGN.md, GOVERNANCE.md, RELEASING.md, config
comments, and source docstrings for casual or idiomatic wording and
replaced it with direct professional language, e.g.:

- 'drift pages someone' -> 'drift raises an alert'
- 'a cold store can't page anyone' -> 'no alerts fire until enough
  triage history exists'
- 'statistically honest' -> 'evidence-weighted'
- 'keeps thin evidence humble' -> 'limits the influence of small
  samples'
- 'compressed ceremony' / 'stop-the-line event' -> plain equivalents
- 'is the scoring actually right?' heading -> 'measuring scoring
  accuracy' (cross-link anchor updated)
- 'keep URLs sane' / 'a sane context size' -> precise wording

No behavior changes; docx regenerated.

Co-Authored-By: Claude Fable 5 <noreply@anthropic.com>
</commit_message>
<xml_diff>
--- a/docs/DESIGN.docx
+++ b/docs/DESIGN.docx
@@ -2702,7 +2702,7 @@
         <w:spacing w:after="120"/>
       </w:pPr>
       <w:r>
-        <w:t xml:space="preserve">The persisted validation decisions are also a training signal. Before export, apply_feedback builds a prior from the manual confirmed (true positive) and false_positive decisions in the state store, aggregated by weakness family (CWE) and component. A new finding sharing a trait the org has repeatedly dismissed is nudged down; one repeatedly confirmed, up — so the scanner adapts to this estate rather than scoring every run identically. Conservative and explainable: capped (max_adjust), gated on a minimum sample (min_evidence), a finding never adjusts itself, only accuracy states count (not risk_accepted/resolved), it moves only the machine score (never the analyst's state), and a KEV finding is never pushed below kev_floor. Evidence is weighted, not just counted — delta = max_adjust * (W+ - W-) / (W+ + W- + shrinkage), each decision's weight decayed by age (halving every half_life_days) and boosted when made in the same repo as the new finding (same_repo_boost); the shrinkage pseudo-count keeps thin evidence humble (two unanimous decisions nudge, twenty approach the cap). Each adjusted finding records the reason in its rationale + a feedback-adjusted tag, and the scan's audit event carries the adjusted count. The same history also reaches the model directly: TriageHistory packages per-finding confirmed/false-positive counts — plus up to three most-recent analyst notes labeled with their outcome — for the exploitability prompt (5.4, feedback.prompt_history). The notes make the history transferable: 'false_positive: vendored test fixture' tells the model when the precedent applies, where a bare count can't. The two mechanisms are complementary — the prompt context lets the model reason with the org's ground truth (and discount it when it doesn't transfer), while the score prior remains a deterministic, bounded backstop that works even when the AI stage is off.</w:t>
+        <w:t xml:space="preserve">The persisted validation decisions are also a training signal. Before export, apply_feedback builds a prior from the manual confirmed (true positive) and false_positive decisions in the state store, aggregated by weakness family (CWE) and component. A new finding sharing a trait the org has repeatedly dismissed is nudged down; one repeatedly confirmed, up — so the scanner adapts to this estate rather than scoring every run identically. Conservative and explainable: capped (max_adjust), gated on a minimum sample (min_evidence), a finding never adjusts itself, only accuracy states count (not risk_accepted/resolved), it moves only the machine score (never the analyst's state), and a KEV finding is never pushed below kev_floor. Evidence is weighted, not just counted — delta = max_adjust * (W+ - W-) / (W+ + W- + shrinkage), each decision's weight decayed by age (halving every half_life_days) and boosted when made in the same repo as the new finding (same_repo_boost); the shrinkage pseudo-count limits the influence of small samples (two unanimous decisions produce a small adjustment; twenty approach the cap). Each adjusted finding records the reason in its rationale + a feedback-adjusted tag, and the scan's audit event carries the adjusted count. The same history also reaches the model directly: TriageHistory packages per-finding confirmed/false-positive counts — plus up to three most-recent analyst notes labeled with their outcome — for the exploitability prompt (5.4, feedback.prompt_history). The notes make the history transferable: 'false_positive: vendored test fixture' tells the model when the precedent applies, where a bare count can't. The two mechanisms are complementary — the prompt context lets the model reason with the org's ground truth (and discount it when it doesn't transfer), while the score prior remains a deterministic, bounded backstop that works even when the AI stage is off.</w:t>
       </w:r>
     </w:p>
     <w:p>
@@ -2719,7 +2719,7 @@
         <w:spacing w:after="120"/>
       </w:pPr>
       <w:r>
-        <w:t xml:space="preserve">The feedback prior adapts scores; the calibration report measures whether the scores were right to begin with. It joins each manual confirmed / false_positive decision to the machine-belief snapshot frozen with it (5.7) and reports: the confirm rate by predicted-score bucket (0-39 / 40-59 / 60-79 / 80-100) — rising with the bucket means the composite score predicts analyst outcomes, flat or inverted means the weights or the AI stage need work; the score separation (mean predicted score of confirmed vs false-positive decisions); and the noisiest keys — CWE families/components whose manual history is dominated by false positives (the same keys the feedback prior nudges), a concrete scanner-tuning worklist. Like the prior, it uses only accuracy states, and it is read-only — it changes nothing, it grades. Decisions persisted before snapshots existed count toward totals but cannot be bucketed (reported as unscored). Surfaced as GET /api/calibration, the UI Calibration tab, and codescan calibration on the CLI. Because the snapshot captures what the configured pipeline predicted, the report also makes provider/model routing changes (5.5) empirically comparable over time. Drift alerting (thresholds in the calibration config section) turns the pull-based report into a continuous-monitoring control: after each scan the pipeline re-grades the history and raises a calibration.drift audit event — fanning out to the SIEM sinks — when the 80-100 bucket's confirm rate falls below min_high_confirm_rate or the confirmed-vs-false-positive mean-score gap falls below min_separation; both checks stay silent below min_bucket_decisions of evidence, so a cold store can't page anyone. Alerts also surface in the Calibration tab and the CLI report.</w:t>
+        <w:t xml:space="preserve">The feedback prior adapts scores; the calibration report measures whether the scores were right to begin with. It joins each manual confirmed / false_positive decision to the machine-belief snapshot frozen with it (5.7) and reports: the confirm rate by predicted-score bucket (0-39 / 40-59 / 60-79 / 80-100) — rising with the bucket means the composite score predicts analyst outcomes, flat or inverted means the weights or the AI stage need work; the score separation (mean predicted score of confirmed vs false-positive decisions); and the noisiest keys — CWE families/components whose manual history is dominated by false positives (the same keys the feedback prior nudges), a concrete scanner-tuning worklist. Like the prior, it uses only accuracy states, and it is read-only — it changes nothing, it grades. Decisions persisted before snapshots existed count toward totals but cannot be bucketed (reported as unscored). Surfaced as GET /api/calibration, the UI Calibration tab, and codescan calibration on the CLI. Because the snapshot captures what the configured pipeline predicted, the report also makes provider/model routing changes (5.5) empirically comparable over time. Drift alerting (thresholds in the calibration config section) turns the pull-based report into a continuous-monitoring control: after each scan the pipeline re-grades the history and raises a calibration.drift audit event — fanning out to the SIEM sinks — when the 80-100 bucket's confirm rate falls below min_high_confirm_rate or the confirmed-vs-false-positive mean-score gap falls below min_separation; both checks stay silent below min_bucket_decisions of evidence, so a new deployment or a small number of disagreeing decisions does not trigger alerts. Alerts also surface in the Calibration tab and the CLI report.</w:t>
       </w:r>
     </w:p>
     <w:p>

</xml_diff>

<commit_message>
feat: API rate limiting + per-scan ceiling (OWASP LLM04/10)
Defends against unbounded resource/LLM consumption. A per-client
token-bucket limiter (ratelimit.py) throttles /api/* by SSO actor or
client IP, running ahead of the token guard so a flood is rejected
with 429 + Retry-After before any work; idle buckets are evicted so
the map can't grow without bound. A per-scan ceiling
(server.max_findings_per_scan) caps the findings any single run
processes, keeping the highest-severity ones and emitting a
scan.truncated audit event when it trims.

New server: config section (rate_limit_enabled/rpm/burst,
max_findings_per_scan), surfaced read-only in the config API.

Co-Authored-By: Claude Fable 5 <noreply@anthropic.com>
</commit_message>
<xml_diff>
--- a/docs/DESIGN.docx
+++ b/docs/DESIGN.docx
@@ -4172,6 +4172,19 @@
       </w:pPr>
       <w:r>
         <w:t xml:space="preserve">Optional API-token guard — CODESCAN_API_TOKEN guards /api/* (Authorization: Bearer, X-API-Token, or a cookie set from /?token=) with a constant-time compare; healthz and the static shell stay open. Defense in depth for accidental exposure; SSO/RBAC belongs at the reverse proxy.</w:t>
+      </w:r>
+    </w:p>
+    <w:p>
+      <w:pPr>
+        <w:pStyle w:val="ListParagraph"/>
+        <w:numPr>
+          <w:ilvl w:val="0"/>
+          <w:numId w:val="1"/>
+        </w:numPr>
+        <w:spacing w:after="40"/>
+      </w:pPr>
+      <w:r>
+        <w:t xml:space="preserve">Resource controls against unbounded consumption (ratelimit.py, OWASP LLM04/10) — a per-client token-bucket limiter throttles /api/* (server.rate_limit_rpm/burst, keyed by SSO actor or client IP) ahead of the token guard, so a flood is cheap to reject with 429; a per-scan ceiling (server.max_findings_per_scan) bounds the cost of any single run, keeping the highest-severity findings and recording a scan.truncated audit event when it trims. Set at startup; behind a load balancer the proxy's limiter is still preferred.</w:t>
       </w:r>
     </w:p>
     <w:p>

</xml_diff>

<commit_message>
fix: run the rate limiter outside the token guard (throttle auth brute-force)
Review finding: Starlette runs the last-registered middleware outermost,
so with the previous registration order the token guard ran BEFORE the
rate limiter — contradicting the code comment and DESIGN.md "runs ahead
of the token guard". The effect was a real weakness: failed-auth
requests were rejected with 401 before reaching the limiter, so
API-token brute-force attempts were entirely unthrottled.

Register the rate limiter last so it sits outermost and wraps auth:
bad-token floods now consume the limit and hit 429. Adds a regression
test asserting a bad-token flood is throttled (429), not an unlimited
stream of 401s. Documents the limiter's keying (SSO actor, else client
IP) and the X-Forwarded-For spoofing caveat when directly exposed.

Also updates the DESIGN testing list (test_cli.py) and the README CLI
flags summary (--whitebox).

Co-Authored-By: Claude Fable 5 <noreply@anthropic.com>
</commit_message>
<xml_diff>
--- a/docs/DESIGN.docx
+++ b/docs/DESIGN.docx
@@ -5028,7 +5028,7 @@
         <w:spacing w:after="40"/>
       </w:pPr>
       <w:r>
-        <w:t xml:space="preserve">Web API (tests/test_web.py) — FastAPI TestClient over state, scan, state-change (persisted across rescan), validation, ServiceNow, the API-token guard, and rate limiting (429 on flood, healthz unthrottled).</w:t>
+        <w:t xml:space="preserve">Web API (tests/test_web.py) — FastAPI TestClient over state, scan, state-change (persisted across rescan), validation, ServiceNow, the API-token guard, and rate limiting (429 on flood, healthz unthrottled, limiter wrapping auth so bad-token brute-force is throttled).</w:t>
       </w:r>
     </w:p>
     <w:p>
@@ -5042,6 +5042,19 @@
       </w:pPr>
       <w:r>
         <w:t xml:space="preserve">Rate limiter (tests/test_ratelimit.py) — token-bucket burst/refill, per-client isolation, idle eviction.</w:t>
+      </w:r>
+    </w:p>
+    <w:p>
+      <w:pPr>
+        <w:pStyle w:val="ListParagraph"/>
+        <w:numPr>
+          <w:ilvl w:val="0"/>
+          <w:numId w:val="1"/>
+        </w:numPr>
+        <w:spacing w:after="40"/>
+      </w:pPr>
+      <w:r>
+        <w:t xml:space="preserve">CLI wiring (tests/test_cli.py) — --whitebox enables the built-in OpenHack engine for the target repo and is rejected with --no-ai.</w:t>
       </w:r>
     </w:p>
     <w:p>

</xml_diff>

<commit_message>
Foundry connection updates and UI changes for its usage
</commit_message>
<xml_diff>
--- a/docs/DESIGN.docx
+++ b/docs/DESIGN.docx
@@ -927,7 +927,7 @@
       <w:r>
         <w:drawing>
           <wp:inline distT="0" distB="0" distL="0" distR="0">
-            <wp:extent cx="5943600" cy="3076575"/>
+            <wp:extent cx="5943600" cy="3286125"/>
             <wp:effectExtent t="0" r="0" b="0" l="0"/>
             <wp:docPr id="1" name="" descr="" title=""/>
             <wp:cNvGraphicFramePr>
@@ -952,7 +952,7 @@
                   <pic:spPr bwMode="auto">
                     <a:xfrm>
                       <a:off x="0" y="0"/>
-                      <a:ext cx="5943600" cy="3076575"/>
+                      <a:ext cx="5943600" cy="3286125"/>
                     </a:xfrm>
                     <a:prstGeom prst="rect">
                       <a:avLst/>
@@ -1883,7 +1883,7 @@
         <w:spacing w:after="120"/>
       </w:pPr>
       <w:r>
-        <w:t xml:space="preserve">Every AI stage runs through the Foundry provider (providers/): all models are served by one Microsoft Azure AI Foundry resource (FOUNDRY_API_KEY + FOUNDRY_RESOURCE, or FOUNDRY_BASE_URL / AZURE_OPENAI_*; FOUNDRY_API_VERSION for classic Azure OpenAI endpoints). The model name picks the API surface: claude-* deployments use Anthropic's native Messages API on the resource (structured outputs, adaptive thinking, effort, client-side Fable refusal fallbacks); any other deployment — OpenAI GPT, Google Gemini, Mistral — uses the resource's OpenAI-compatible endpoint (JSON mode + defensive parsing). Both paths implement the same complete_json contract; SDKs are imported lazily, so they are optional deps. ModelRouter resolves a task to a ModelSpec (provider + model + effort + token budget) and LLMClient dispatches through the registry, so a task can run on any model deployment, set in config.</w:t>
+        <w:t xml:space="preserve">Every AI stage runs through the Foundry provider (providers/): all models are served by one Microsoft Azure AI Foundry resource (FOUNDRY_API_KEY + FOUNDRY_RESOURCE, or FOUNDRY_BASE_URL / AZURE_OPENAI_*; FOUNDRY_API_VERSION for classic Azure OpenAI endpoints). The model name picks the API surface: claude-* deployments use Anthropic's native Messages API on the resource (structured outputs, adaptive thinking, effort, client-side Fable refusal fallbacks); any other deployment — OpenAI GPT, Mistral — uses the resource's OpenAI-compatible endpoint (JSON mode + defensive parsing). Both paths implement the same complete_json contract; SDKs are imported lazily, so they are optional deps. ModelRouter resolves a task to a ModelSpec (provider + model + effort + token budget) and LLMClient dispatches through the registry, so a task can run on any model deployment, set in config.</w:t>
       </w:r>
     </w:p>
     <w:tbl>
@@ -2255,7 +2255,7 @@
         <w:spacing w:after="120"/>
       </w:pPr>
       <w:r>
-        <w:t xml:space="preserve">The provider omits effort / adaptive thinking for models that don't support them (Haiku) and registers the Anthropic SDK's client-side refusal fallback for Fable/Mythos (security tooling can trip false-positive classifier refusals; the request transparently re-serves on Opus 4.8 — Foundry has no server-side fallback support). Config ai.tasks.&lt;name&gt; overrides any field per task. Adding a new AI stage is a one-liner.</w:t>
+        <w:t xml:space="preserve">The provider omits effort / adaptive thinking for models that don't support them (Haiku), retries with the schema prompted instead of enforced when a Foundry workspace rejects structured outputs (beta there, per model/workspace), and registers the Anthropic SDK's client-side refusal fallback for Fable/Mythos (security tooling can trip false-positive classifier refusals; the request transparently re-serves on Opus 4.8 — Foundry has no server-side fallback support). Config ai.tasks.&lt;name&gt; overrides any field per task. Adding a new AI stage is a one-liner.</w:t>
       </w:r>
     </w:p>
     <w:p>
@@ -2777,7 +2777,7 @@
         <w:spacing w:after="120"/>
       </w:pPr>
       <w:r>
-        <w:t xml:space="preserve">Config: edit non-secret settings live — the repo source (Bitbucket/GitHub) and GitHub repo/org targets, default AI tier, per-task model routing, enrichment toggles, threat-modeling toggle, scoring weights, and the ServiceNow push flag/format. Secrets are shown masked and read-only (they stay in the environment). Edits apply to the next scan and persist to config.overrides.json, layered over the base config on restart; POST is validated server-side and rejected with 400 on bad input.</w:t>
+        <w:t xml:space="preserve">Config: edit non-secret settings live — the repo source (Bitbucket/GitHub) and GitHub repo/org targets, default AI tier, per-task model routing, enrichment toggles, threat-modeling toggle, scoring weights, and the ServiceNow push flag/format. Model suggestions are the Foundry resource's live deployment list (fetched with the inference API key, cached five minutes; a curated static list when the resource isn't reachable). Secrets are shown masked and read-only (they stay in the environment). Edits apply to the next scan and persist to config.overrides.json, layered over the base config on restart; POST is validated server-side and rejected with 400 on bad input.</w:t>
       </w:r>
     </w:p>
     <w:p>
@@ -2785,7 +2785,7 @@
         <w:spacing w:after="120"/>
       </w:pPr>
       <w:r>
-        <w:t xml:space="preserve">Scans run from the header (AI / offline / live toggles + Run scan) via POST /api/scan, in-process, recording a last-run timestamp. On-demand live scans of Bitbucket/Snyk/Xray are supported, not just the boot mode. A failed run — e.g. live mode without credentials — is caught and shown in an error banner with the last good result preserved, rather than returning a 500; /healthz backs the container probe.</w:t>
+        <w:t xml:space="preserve">Scans run from the header (AI / offline / live toggles + Run scan) via POST /api/scan, in-process, recording a last-run timestamp. On-demand live scans of Bitbucket/Snyk/Xray are supported, not just the boot mode, and the request can carry one-shot GitHub targets (repos: ["owner/name", ...], plus whitebox for a built-in OpenHack source review — the UI equivalent of scan --repo/--whitebox): the run is scoped on a deep copy of the config, so the server's configured source is untouched; malformed targets or whitebox without AI return 400. A failed run — e.g. live mode without credentials — is caught and shown in an error banner with the last good result preserved, rather than returning a 500; /healthz backs the container probe.</w:t>
       </w:r>
     </w:p>
     <w:p>

</xml_diff>

<commit_message>
Add new test to a live GitHub repo
</commit_message>
<xml_diff>
--- a/docs/DESIGN.docx
+++ b/docs/DESIGN.docx
@@ -5042,6 +5042,19 @@
       </w:pPr>
       <w:r>
         <w:t xml:space="preserve">CLI wiring (tests/test_cli.py) — --whitebox enables the built-in OpenHack engine for the target repo and is rejected with --no-ai.</w:t>
+      </w:r>
+    </w:p>
+    <w:p>
+      <w:pPr>
+        <w:pStyle w:val="ListParagraph"/>
+        <w:numPr>
+          <w:ilvl w:val="0"/>
+          <w:numId w:val="1"/>
+        </w:numPr>
+        <w:spacing w:after="40"/>
+      </w:pPr>
+      <w:r>
+        <w:t xml:space="preserve">Live CLI smoke (tests/test_cli_live.py) — opt-in, excluded from the offline gate (skips unless CODESCAN_LIVE_TEST=1): loads .env, picks a Claude deployment that exists on the Foundry resource, and runs the real codescan scan CLI over the fixtures with the AI stages live — proving the CLI -&gt; pipeline -&gt; Foundry -&gt; ServiceNow-export path end to end.</w:t>
       </w:r>
     </w:p>
     <w:p>

</xml_diff>